<commit_message>
Sahaba thesis: add Seerat-e-Muhammadia (Mawahib) for Dhat as-Salasil and Bir Maoona, year 1449, fix blank page, update guide
Co-Authored-By: Claude Opus 5.5 <noreply@anthropic.com>
Claude-Session: https://claude.ai/code/session_01UVcrkFAwrbrBas8hPMwJZW
</commit_message>
<xml_diff>
--- a/Sahaba/maqala/maqala-sahaba-mukammal.docx
+++ b/Sahaba/maqala/maqala-sahaba-mukammal.docx
@@ -574,7 +574,7 @@
                 <w:szCs w:val="26"/>
                 <w:rtl/>
               </w:rPr>
-              <w:t xml:space="preserve">شعبہ امتحانات شہادۃ العالمیہ تنظیم المدارس اہلسنت پاکستان ۱۴۴۸ھ بمطابق ۲۰۲۷ء</w:t>
+              <w:t xml:space="preserve">شعبہ امتحانات شہادۃ العالمیہ تنظیم المدارس اہلسنت پاکستان ۱۴۴۹ھ بمطابق ۲۰۲۷ء</w:t>
             </w:r>
           </w:p>
         </w:tc>
@@ -3274,6 +3274,23 @@
           <w:szCs w:val="30"/>
           <w:rtl/>
         </w:rPr>
+        <w:t xml:space="preserve">٭ سریہ ذات السلاسل اور سانحۂ بئر معونہ کے بعض واقعات کے لیے مواہبِ لدنیہ کے ایک دوسرے اردو ترجمے "سیرتِ محمدیہ" (ترتیب و تدوین: محمد عبدالستار طاہر مسعودی) سے بھی استفادہ کیا گیا ہے، اور اس کے حوالے الگ درج کیے گئے ہیں۔</w:t>
+      </w:r>
+    </w:p>
+    <w:p>
+      <w:pPr>
+        <w:bidi/>
+        <w:spacing w:after="80" w:before="0" w:line="240" w:lineRule="auto"/>
+        <w:ind w:start="300"/>
+        <w:jc w:val="both"/>
+      </w:pPr>
+      <w:r>
+        <w:rPr>
+          <w:rFonts w:ascii="Jameel Noori Nastaleeq" w:cs="Jameel Noori Nastaleeq" w:eastAsia="Jameel Noori Nastaleeq" w:hAnsi="Jameel Noori Nastaleeq"/>
+          <w:sz w:val="30"/>
+          <w:szCs w:val="30"/>
+          <w:rtl/>
+        </w:rPr>
         <w:t xml:space="preserve">٭ قرآنی آیات کا اردو ترجمہ اعلیٰ حضرت امام احمد رضا خان علیہ الرحمہ کے ترجمۂ قرآن "کنز الایمان" سے لیا گیا ہے۔</w:t>
       </w:r>
     </w:p>
@@ -4348,15 +4365,6 @@
         </w:tc>
       </w:tr>
     </w:tbl>
-    <w:p>
-      <w:r>
-        <w:rPr>
-          <w:sz w:val="30"/>
-          <w:szCs w:val="30"/>
-        </w:rPr>
-        <w:t xml:space="preserve"/>
-      </w:r>
-    </w:p>
     <w:p>
       <w:pPr>
         <w:pageBreakBefore/>
@@ -14443,13 +14451,28 @@
           <w:szCs w:val="30"/>
           <w:rtl/>
         </w:rPr>
-        <w:t xml:space="preserve"> واپسی میں حضرت عمرو بن امیہ نے بنو عامر کے دو آدمیوں کو سوتے میں قتل کر دیا، حالانکہ ان کا رسول اللہ ﷺ سے عہد تھا؛ جب آپ ﷺ کو خبر ہوئی تو فرمایا: تم نے ایسے دو آدمیوں کو قتل کیا ہے کہ ان کی دیت میں ادا کروں گا۔</w:t>
+        <w:t xml:space="preserve"> مواہبِ لدنیہ کے ایک دوسرے اردو ترجمے "سیرتِ محمدیہ" میں اس کے بعد کا واقعہ یوں ہے کہ حضرت عمرو بن امیہ رضی اللہ عنہ مدینہ کی طرف لوٹے تو راستے میں بنو عامر کے دو آدمی ملے جن کا رسول اللہ ﷺ سے عہد تھا، اور حضرت عمرو کو اس عہد کا علم نہ تھا؛ انہوں نے ان سے پوچھا تو انہوں نے بتایا کہ وہ بنو عامر سے ہیں، چنانچہ جب وہ سو گئے تو حضرت عمرو نے یہ سمجھ کر انہیں قتل کر دیا کہ انہوں نے اپنے ساتھیوں کا بدلہ لے لیا ہے۔ جب انہوں نے حاضر ہو کر یہ بات بتائی تو رسول اللہ ﷺ نے فرمایا: ان کا میرے ساتھ عہد تھا، تم نے دو ایسے مقتولوں کو قتل کیا ہے جن کی دیت میں دوں گا۔</w:t>
       </w:r>
       <w:r>
         <w:rPr>
           <w:rStyle w:val="FootnoteReference"/>
         </w:rPr>
         <w:footnoteReference w:id="149"/>
+      </w:r>
+      <w:r>
+        <w:rPr>
+          <w:rFonts w:ascii="Jameel Noori Nastaleeq" w:cs="Jameel Noori Nastaleeq" w:eastAsia="Jameel Noori Nastaleeq" w:hAnsi="Jameel Noori Nastaleeq"/>
+          <w:sz w:val="30"/>
+          <w:szCs w:val="30"/>
+          <w:rtl/>
+        </w:rPr>
+        <w:t xml:space="preserve"> امام قسطلانی کے مذکورہ ترجمے میں بھی آپ ﷺ کا یہی ارشاد منقول ہے۔</w:t>
+      </w:r>
+      <w:r>
+        <w:rPr>
+          <w:rStyle w:val="FootnoteReference"/>
+        </w:rPr>
+        <w:footnoteReference w:id="150"/>
       </w:r>
     </w:p>
     <w:p>
@@ -14472,7 +14495,7 @@
         <w:rPr>
           <w:rStyle w:val="FootnoteReference"/>
         </w:rPr>
-        <w:footnoteReference w:id="150"/>
+        <w:footnoteReference w:id="151"/>
       </w:r>
       <w:bookmarkStart w:name="hd21" w:id="1"/>
       <w:r>
@@ -14492,7 +14515,7 @@
         <w:rPr>
           <w:rStyle w:val="FootnoteReference"/>
         </w:rPr>
-        <w:footnoteReference w:id="151"/>
+        <w:footnoteReference w:id="152"/>
       </w:r>
     </w:p>
     <w:p>
@@ -14526,22 +14549,22 @@
         <w:rPr>
           <w:rStyle w:val="FootnoteReference"/>
         </w:rPr>
-        <w:footnoteReference w:id="152"/>
-      </w:r>
-      <w:r>
-        <w:rPr>
-          <w:rFonts w:ascii="Jameel Noori Nastaleeq" w:cs="Jameel Noori Nastaleeq" w:eastAsia="Jameel Noori Nastaleeq" w:hAnsi="Jameel Noori Nastaleeq"/>
-          <w:sz w:val="30"/>
-          <w:szCs w:val="30"/>
-          <w:rtl/>
-        </w:rPr>
-        <w:t xml:space="preserve"> بئر معونہ کے بعد کے واقعات میں بنو عامر کے دو معاہد افراد کی دیت کا مسئلہ ہی آگے چل کر بنو نضیر کے معاملے تک پہنچا؛ امام قسطلانی کے مطابق نبی اکرم ﷺ انہی دو مقتولوں کی دیت میں مدد لینے کے لیے بنو نضیر کے پاس تشریف لے گئے تھے، کیونکہ ان کا آپ ﷺ سے معاہدہ تھا۔</w:t>
-      </w:r>
-      <w:r>
-        <w:rPr>
-          <w:rStyle w:val="FootnoteReference"/>
-        </w:rPr>
         <w:footnoteReference w:id="153"/>
+      </w:r>
+      <w:r>
+        <w:rPr>
+          <w:rFonts w:ascii="Jameel Noori Nastaleeq" w:cs="Jameel Noori Nastaleeq" w:eastAsia="Jameel Noori Nastaleeq" w:hAnsi="Jameel Noori Nastaleeq"/>
+          <w:sz w:val="30"/>
+          <w:szCs w:val="30"/>
+          <w:rtl/>
+        </w:rPr>
+        <w:t xml:space="preserve"> بئر معونہ کے بعد کے واقعات میں بنو عامر کے دو معاہد افراد کی دیت کا مسئلہ ہی آگے چل کر بنو نضیر کے معاملے تک پہنچا؛ امام قسطلانی کے مطابق نبی اکرم ﷺ انہی دو مقتولوں کی دیت میں مدد لینے کے لیے بنو نضیر کے پاس تشریف لے گئے تھے، کیونکہ ان کا آپ ﷺ سے معاہدہ تھا اور بنو نضیر اور بنو عامر کے درمیان بھی حلیفانہ معاہدہ تھا۔</w:t>
+      </w:r>
+      <w:r>
+        <w:rPr>
+          <w:rStyle w:val="FootnoteReference"/>
+        </w:rPr>
+        <w:footnoteReference w:id="154"/>
       </w:r>
     </w:p>
     <w:p>
@@ -14620,7 +14643,7 @@
         <w:rPr>
           <w:rStyle w:val="FootnoteReference"/>
         </w:rPr>
-        <w:footnoteReference w:id="154"/>
+        <w:footnoteReference w:id="155"/>
       </w:r>
       <w:bookmarkStart w:name="hd22" w:id="1"/>
       <w:r>
@@ -14640,7 +14663,7 @@
         <w:rPr>
           <w:rStyle w:val="FootnoteReference"/>
         </w:rPr>
-        <w:footnoteReference w:id="155"/>
+        <w:footnoteReference w:id="156"/>
       </w:r>
     </w:p>
     <w:p>
@@ -14710,7 +14733,7 @@
         <w:rPr>
           <w:rStyle w:val="FootnoteReference"/>
         </w:rPr>
-        <w:footnoteReference w:id="156"/>
+        <w:footnoteReference w:id="157"/>
       </w:r>
       <w:r>
         <w:rPr>
@@ -14725,7 +14748,7 @@
         <w:rPr>
           <w:rStyle w:val="FootnoteReference"/>
         </w:rPr>
-        <w:footnoteReference w:id="157"/>
+        <w:footnoteReference w:id="158"/>
       </w:r>
     </w:p>
     <w:p>
@@ -14795,7 +14818,7 @@
         <w:rPr>
           <w:rStyle w:val="FootnoteReference"/>
         </w:rPr>
-        <w:footnoteReference w:id="158"/>
+        <w:footnoteReference w:id="159"/>
       </w:r>
       <w:r>
         <w:rPr>
@@ -14810,7 +14833,7 @@
         <w:rPr>
           <w:rStyle w:val="FootnoteReference"/>
         </w:rPr>
-        <w:footnoteReference w:id="159"/>
+        <w:footnoteReference w:id="160"/>
       </w:r>
       <w:r>
         <w:rPr>
@@ -14825,7 +14848,7 @@
         <w:rPr>
           <w:rStyle w:val="FootnoteReference"/>
         </w:rPr>
-        <w:footnoteReference w:id="160"/>
+        <w:footnoteReference w:id="161"/>
       </w:r>
     </w:p>
     <w:p>
@@ -14867,7 +14890,7 @@
         <w:rPr>
           <w:rStyle w:val="FootnoteReference"/>
         </w:rPr>
-        <w:footnoteReference w:id="161"/>
+        <w:footnoteReference w:id="162"/>
       </w:r>
       <w:r>
         <w:rPr>
@@ -14882,7 +14905,7 @@
         <w:rPr>
           <w:rStyle w:val="FootnoteReference"/>
         </w:rPr>
-        <w:footnoteReference w:id="162"/>
+        <w:footnoteReference w:id="163"/>
       </w:r>
       <w:r>
         <w:rPr>
@@ -14897,7 +14920,7 @@
         <w:rPr>
           <w:rStyle w:val="FootnoteReference"/>
         </w:rPr>
-        <w:footnoteReference w:id="163"/>
+        <w:footnoteReference w:id="164"/>
       </w:r>
       <w:r>
         <w:rPr>
@@ -14948,7 +14971,7 @@
         <w:rPr>
           <w:rStyle w:val="FootnoteReference"/>
         </w:rPr>
-        <w:footnoteReference w:id="164"/>
+        <w:footnoteReference w:id="165"/>
       </w:r>
       <w:r>
         <w:rPr>
@@ -14963,7 +14986,7 @@
         <w:rPr>
           <w:rStyle w:val="FootnoteReference"/>
         </w:rPr>
-        <w:footnoteReference w:id="165"/>
+        <w:footnoteReference w:id="166"/>
       </w:r>
     </w:p>
     <w:p>
@@ -15033,7 +15056,7 @@
         <w:rPr>
           <w:rStyle w:val="FootnoteReference"/>
         </w:rPr>
-        <w:footnoteReference w:id="166"/>
+        <w:footnoteReference w:id="167"/>
       </w:r>
       <w:r>
         <w:rPr>
@@ -15048,7 +15071,7 @@
         <w:rPr>
           <w:rStyle w:val="FootnoteReference"/>
         </w:rPr>
-        <w:footnoteReference w:id="167"/>
+        <w:footnoteReference w:id="168"/>
       </w:r>
     </w:p>
     <w:p>
@@ -15091,7 +15114,7 @@
         <w:rPr>
           <w:rStyle w:val="FootnoteReference"/>
         </w:rPr>
-        <w:footnoteReference w:id="168"/>
+        <w:footnoteReference w:id="169"/>
       </w:r>
       <w:r>
         <w:rPr>
@@ -17579,7 +17602,7 @@
         <w:rPr>
           <w:rStyle w:val="FootnoteReference"/>
         </w:rPr>
-        <w:footnoteReference w:id="169"/>
+        <w:footnoteReference w:id="170"/>
       </w:r>
     </w:p>
     <w:p>
@@ -17622,7 +17645,7 @@
         <w:rPr>
           <w:rStyle w:val="FootnoteReference"/>
         </w:rPr>
-        <w:footnoteReference w:id="170"/>
+        <w:footnoteReference w:id="171"/>
       </w:r>
       <w:r>
         <w:rPr>
@@ -17637,7 +17660,7 @@
         <w:rPr>
           <w:rStyle w:val="FootnoteReference"/>
         </w:rPr>
-        <w:footnoteReference w:id="171"/>
+        <w:footnoteReference w:id="172"/>
       </w:r>
     </w:p>
     <w:p>
@@ -17680,7 +17703,7 @@
         <w:rPr>
           <w:rStyle w:val="FootnoteReference"/>
         </w:rPr>
-        <w:footnoteReference w:id="172"/>
+        <w:footnoteReference w:id="173"/>
       </w:r>
       <w:r>
         <w:rPr>
@@ -17695,7 +17718,7 @@
         <w:rPr>
           <w:rStyle w:val="FootnoteReference"/>
         </w:rPr>
-        <w:footnoteReference w:id="173"/>
+        <w:footnoteReference w:id="174"/>
       </w:r>
       <w:r>
         <w:rPr>
@@ -17747,7 +17770,7 @@
         <w:rPr>
           <w:rStyle w:val="FootnoteReference"/>
         </w:rPr>
-        <w:footnoteReference w:id="174"/>
+        <w:footnoteReference w:id="175"/>
       </w:r>
       <w:r>
         <w:rPr>
@@ -17799,7 +17822,7 @@
         <w:rPr>
           <w:rStyle w:val="FootnoteReference"/>
         </w:rPr>
-        <w:footnoteReference w:id="175"/>
+        <w:footnoteReference w:id="176"/>
       </w:r>
       <w:r>
         <w:rPr>
@@ -17814,7 +17837,7 @@
         <w:rPr>
           <w:rStyle w:val="FootnoteReference"/>
         </w:rPr>
-        <w:footnoteReference w:id="176"/>
+        <w:footnoteReference w:id="177"/>
       </w:r>
     </w:p>
     <w:p>
@@ -17856,7 +17879,7 @@
         <w:rPr>
           <w:rStyle w:val="FootnoteReference"/>
         </w:rPr>
-        <w:footnoteReference w:id="177"/>
+        <w:footnoteReference w:id="178"/>
       </w:r>
       <w:r>
         <w:rPr>
@@ -17871,7 +17894,7 @@
         <w:rPr>
           <w:rStyle w:val="FootnoteReference"/>
         </w:rPr>
-        <w:footnoteReference w:id="178"/>
+        <w:footnoteReference w:id="179"/>
       </w:r>
       <w:r>
         <w:rPr>
@@ -17939,7 +17962,7 @@
         <w:rPr>
           <w:rStyle w:val="FootnoteReference"/>
         </w:rPr>
-        <w:footnoteReference w:id="179"/>
+        <w:footnoteReference w:id="180"/>
       </w:r>
       <w:bookmarkStart w:name="hd23" w:id="1"/>
       <w:r>
@@ -17967,7 +17990,7 @@
         <w:rPr>
           <w:rStyle w:val="FootnoteReference"/>
         </w:rPr>
-        <w:footnoteReference w:id="180"/>
+        <w:footnoteReference w:id="181"/>
       </w:r>
       <w:r>
         <w:rPr>
@@ -17982,7 +18005,7 @@
         <w:rPr>
           <w:rStyle w:val="FootnoteReference"/>
         </w:rPr>
-        <w:footnoteReference w:id="181"/>
+        <w:footnoteReference w:id="182"/>
       </w:r>
     </w:p>
     <w:p>
@@ -18024,7 +18047,7 @@
         <w:rPr>
           <w:rStyle w:val="FootnoteReference"/>
         </w:rPr>
-        <w:footnoteReference w:id="182"/>
+        <w:footnoteReference w:id="183"/>
       </w:r>
       <w:r>
         <w:rPr>
@@ -18039,7 +18062,7 @@
         <w:rPr>
           <w:rStyle w:val="FootnoteReference"/>
         </w:rPr>
-        <w:footnoteReference w:id="183"/>
+        <w:footnoteReference w:id="184"/>
       </w:r>
     </w:p>
     <w:p>
@@ -18081,7 +18104,7 @@
         <w:rPr>
           <w:rStyle w:val="FootnoteReference"/>
         </w:rPr>
-        <w:footnoteReference w:id="184"/>
+        <w:footnoteReference w:id="185"/>
       </w:r>
       <w:r>
         <w:rPr>
@@ -18096,7 +18119,7 @@
         <w:rPr>
           <w:rStyle w:val="FootnoteReference"/>
         </w:rPr>
-        <w:footnoteReference w:id="185"/>
+        <w:footnoteReference w:id="186"/>
       </w:r>
       <w:r>
         <w:rPr>
@@ -18111,7 +18134,7 @@
         <w:rPr>
           <w:rStyle w:val="FootnoteReference"/>
         </w:rPr>
-        <w:footnoteReference w:id="186"/>
+        <w:footnoteReference w:id="187"/>
       </w:r>
     </w:p>
     <w:p>
@@ -18153,7 +18176,7 @@
         <w:rPr>
           <w:rStyle w:val="FootnoteReference"/>
         </w:rPr>
-        <w:footnoteReference w:id="187"/>
+        <w:footnoteReference w:id="188"/>
       </w:r>
       <w:bookmarkStart w:name="hd24" w:id="1"/>
       <w:r>
@@ -18181,7 +18204,7 @@
         <w:rPr>
           <w:rStyle w:val="FootnoteReference"/>
         </w:rPr>
-        <w:footnoteReference w:id="188"/>
+        <w:footnoteReference w:id="189"/>
       </w:r>
       <w:bookmarkStart w:name="hd25" w:id="1"/>
       <w:r>
@@ -18209,7 +18232,7 @@
         <w:rPr>
           <w:rStyle w:val="FootnoteReference"/>
         </w:rPr>
-        <w:footnoteReference w:id="189"/>
+        <w:footnoteReference w:id="190"/>
       </w:r>
     </w:p>
     <w:p>
@@ -18251,7 +18274,7 @@
         <w:rPr>
           <w:rStyle w:val="FootnoteReference"/>
         </w:rPr>
-        <w:footnoteReference w:id="190"/>
+        <w:footnoteReference w:id="191"/>
       </w:r>
       <w:r>
         <w:rPr>
@@ -18266,7 +18289,7 @@
         <w:rPr>
           <w:rStyle w:val="FootnoteReference"/>
         </w:rPr>
-        <w:footnoteReference w:id="191"/>
+        <w:footnoteReference w:id="192"/>
       </w:r>
     </w:p>
     <w:p>
@@ -18303,7 +18326,7 @@
           <w:szCs w:val="36"/>
           <w:rtl/>
         </w:rPr>
-        <w:t xml:space="preserve">3: سریہ ذات السلاسل (8ھ)</w:t>
+        <w:t xml:space="preserve">3: سریہ ذات السلاسل (جمادی الآخرہ 8ھ)</w:t>
       </w:r>
     </w:p>
     <w:p>
@@ -18320,13 +18343,13 @@
           <w:szCs w:val="30"/>
           <w:rtl/>
         </w:rPr>
-        <w:t xml:space="preserve">شیخ عبدالحق محدث دہلوی علیہ الرحمہ کے مطابق اس سریے کا سبب یہ تھا کہ قبیلۂ قضاعہ، بلی اور بنو القین نے متفقہ طور پر مدینہ طیبہ کے اطراف پر حملہ کرنے کا ارادہ کیا۔ حضور ﷺ نے ایک سفید علم تیار فرمایا اور تین سو مسلمانوں کی جماعت بنائی جن میں اعیانِ انصار و مہاجرین تھے، اور حضرت عمرو بن العاص رضی اللہ عنہ کو اس کا امیر مقرر کیا؛ انہیں خاص طور پر نامزد کرنے کی حکمت یہ تھی کہ ان کی ماں کی طرف سے قبیلۂ بلی کے ساتھ قرابت داری تھی۔ وہاں پہنچ کر انہوں نے مدد کے لیے قاصد بھیجا تو حضور ﷺ نے حضرت ابو عبیدہ بن جراح رضی اللہ عنہ کی قیادت میں ایک جماعت بھیجی جس میں حضرت ابوبکر اور حضرت عمر رضی اللہ عنہما بھی شامل تھے، اور روانگی کے وقت نصیحت فرمائی کہ جب یکجا ہو جاؤ تو آپس میں اختلاف نہ کرنا۔ وہاں پہنچ کر حضرت ابو عبیدہ رضی اللہ عنہ نے امامت اور امارت دونوں میں حضرت عمرو بن العاص رضی اللہ عنہ کی قیادت تسلیم کر لی۔</w:t>
-      </w:r>
-      <w:r>
-        <w:rPr>
-          <w:rStyle w:val="FootnoteReference"/>
-        </w:rPr>
-        <w:footnoteReference w:id="192"/>
+        <w:t xml:space="preserve">مواہبِ لدنیہ کے ترجمہ "سیرتِ محمدیہ" کے مطابق یہ سریہ جمادی الآخرہ 8ھ میں روانہ ہوا، اور اس کا سبب یہ تھا کہ رسول اللہ ﷺ کو خبر ملی کہ قضاعہ کی ایک جماعت حملے کے لیے جمع ہو رہی ہے۔ آپ ﷺ نے حضرت عمرو بن العاص رضی اللہ عنہ کے لیے ایک سفید جھنڈا قائم کیا اور ایک سیاہ جھنڈا بھی ساتھ کر دیا؛ ان کی سرکردگی میں مہاجرین و انصار کے تین سو منتخب مجاہد تھے اور لشکر میں تیس گھوڑے تھے۔ یہ لوگ رات کو سفر کرتے اور دن کو چھپ کر رہتے تھے۔ جب قضاعہ کے قریب پہنچے تو معلوم ہوا کہ مقابلے میں ایک بڑی جماعت ہے، چنانچہ حضرت عمرو رضی اللہ عنہ نے حضرت رافع بن مکیث جہنی رضی اللہ عنہ کو مدد کے لیے رسول اللہ ﷺ کے پاس بھیجا۔ آپ ﷺ نے حضرت ابو عبیدہ بن جراح رضی اللہ عنہ کو دو سو مجاہدین کے ساتھ روانہ فرمایا، جن میں مہاجرین و انصار کے منتخب حضرات تھے اور حضرت ابوبکر صدیق اور حضرت عمر فاروق رضی اللہ عنہما بھی شامل تھے، اور حکم دیا کہ حضرت عمرو سے جا ملیں اور دونوں متفق رہیں، باہم اختلاف نہ کریں۔</w:t>
+      </w:r>
+      <w:r>
+        <w:rPr>
+          <w:rStyle w:val="FootnoteReference"/>
+        </w:rPr>
+        <w:footnoteReference w:id="193"/>
       </w:r>
     </w:p>
     <w:p>
@@ -18339,6 +18362,67 @@
       <w:r>
         <w:rPr>
           <w:rFonts w:ascii="Jameel Noori Nastaleeq" w:cs="Jameel Noori Nastaleeq" w:eastAsia="Jameel Noori Nastaleeq" w:hAnsi="Jameel Noori Nastaleeq"/>
+          <w:sz w:val="30"/>
+          <w:szCs w:val="30"/>
+          <w:rtl/>
+        </w:rPr>
+        <w:t xml:space="preserve">شیخ عبدالحق محدث دہلوی علیہ الرحمہ نے اس سریے کا سبب یہ لکھا ہے کہ قبیلۂ قضاعہ، بلی اور بنو القین نے متفقہ طور پر مدینہ طیبہ کے اطراف پر حملہ کرنے کا ارادہ کیا تھا، اور حضرت عمرو بن العاص رضی اللہ عنہ کو خاص طور پر نامزد کرنے کی حکمت یہ تھی کہ ان کی ماں کی طرف سے قبیلۂ بلی کے ساتھ قرابت داری تھی۔</w:t>
+      </w:r>
+      <w:r>
+        <w:rPr>
+          <w:rStyle w:val="FootnoteReference"/>
+        </w:rPr>
+        <w:footnoteReference w:id="194"/>
+      </w:r>
+    </w:p>
+    <w:p>
+      <w:pPr>
+        <w:bidi/>
+        <w:spacing w:after="80" w:before="0" w:line="240" w:lineRule="auto"/>
+        <w:ind w:firstLine="0"/>
+        <w:jc w:val="both"/>
+      </w:pPr>
+      <w:r>
+        <w:rPr>
+          <w:rFonts w:ascii="Jameel Noori Nastaleeq" w:cs="Jameel Noori Nastaleeq" w:eastAsia="Jameel Noori Nastaleeq" w:hAnsi="Jameel Noori Nastaleeq"/>
+          <w:sz w:val="30"/>
+          <w:szCs w:val="30"/>
+          <w:rtl/>
+        </w:rPr>
+        <w:t xml:space="preserve">وہاں پہنچ کر حضرت ابو عبیدہ رضی اللہ عنہ نے صحابہ کی امامت کا ارادہ کیا تو حضرت عمرو بن العاص رضی اللہ عنہ نے کہا: تم مدد کے لیے آئے ہو اور میں لشکر کا امیر ہوں۔ حضرت ابو عبیدہ رضی اللہ عنہ نے ان کی بات مان لی، اور حضرت عمرو رضی اللہ عنہ مجاہدین کو نماز پڑھاتے رہے۔</w:t>
+      </w:r>
+      <w:r>
+        <w:rPr>
+          <w:rStyle w:val="FootnoteReference"/>
+        </w:rPr>
+        <w:footnoteReference w:id="195"/>
+      </w:r>
+      <w:r>
+        <w:rPr>
+          <w:rFonts w:ascii="Jameel Noori Nastaleeq" w:cs="Jameel Noori Nastaleeq" w:eastAsia="Jameel Noori Nastaleeq" w:hAnsi="Jameel Noori Nastaleeq"/>
+          <w:sz w:val="30"/>
+          <w:szCs w:val="30"/>
+          <w:rtl/>
+        </w:rPr>
+        <w:t xml:space="preserve"> شیخ محقق کے مطابق بھی حضرت ابو عبیدہ رضی اللہ عنہ نے امامت اور امارت دونوں میں حضرت عمرو بن العاص رضی اللہ عنہ کی قیادت تسلیم کر لی۔</w:t>
+      </w:r>
+      <w:r>
+        <w:rPr>
+          <w:rStyle w:val="FootnoteReference"/>
+        </w:rPr>
+        <w:footnoteReference w:id="196"/>
+      </w:r>
+    </w:p>
+    <w:p>
+      <w:pPr>
+        <w:bidi/>
+        <w:spacing w:after="80" w:before="0" w:line="240" w:lineRule="auto"/>
+        <w:ind w:firstLine="0"/>
+        <w:jc w:val="both"/>
+      </w:pPr>
+      <w:r>
+        <w:rPr>
+          <w:rFonts w:ascii="Jameel Noori Nastaleeq" w:cs="Jameel Noori Nastaleeq" w:eastAsia="Jameel Noori Nastaleeq" w:hAnsi="Jameel Noori Nastaleeq"/>
           <w:b/>
           <w:bCs/>
           <w:sz w:val="30"/>
@@ -18354,13 +18438,28 @@
           <w:szCs w:val="30"/>
           <w:rtl/>
         </w:rPr>
-        <w:t xml:space="preserve"> شیخ محقق کے مطابق ان قبیلوں کے کچھ لوگ اپنے گھر خالی کر کے بھاگ گئے اور کچھ نے جنگ کی لیکن مغلوب ہو کر بھاگ گئے۔ اس سریے کے نام کی وجہ یا تو یہ بتائی جاتی ہے کہ مشرکین نے خود کو زنجیروں سے باندھ لیا تھا، یا یہ کہ "سلاسل" وادی القریٰ کے پیچھے ایک چشمے کا نام تھا۔</w:t>
-      </w:r>
-      <w:r>
-        <w:rPr>
-          <w:rStyle w:val="FootnoteReference"/>
-        </w:rPr>
-        <w:footnoteReference w:id="193"/>
+        <w:t xml:space="preserve"> "سیرتِ محمدیہ" کے مطابق حضرت عمرو رضی اللہ عنہ آگے بڑھے یہاں تک کہ دشمن، یعنی بنو بلی اور بنو عذرہ، تک جا پہنچے؛ مسلمانوں نے حملہ کیا تو وہ کچھ دیر لڑے اور پھر بھاگ کر منتشر ہو گئے۔ حضرت عمرو رضی اللہ عنہ نے وہاں چند دن قیام کیا اور سوار بھیج کر اونٹ بکریاں منگواتے رہے جنہیں ذبح کر کے کھا لیا جاتا، اور اس جنگ میں کوئی ایسا مالِ غنیمت ہاتھ نہیں آیا جسے تقسیم کیا جاتا۔</w:t>
+      </w:r>
+      <w:r>
+        <w:rPr>
+          <w:rStyle w:val="FootnoteReference"/>
+        </w:rPr>
+        <w:footnoteReference w:id="197"/>
+      </w:r>
+      <w:r>
+        <w:rPr>
+          <w:rFonts w:ascii="Jameel Noori Nastaleeq" w:cs="Jameel Noori Nastaleeq" w:eastAsia="Jameel Noori Nastaleeq" w:hAnsi="Jameel Noori Nastaleeq"/>
+          <w:sz w:val="30"/>
+          <w:szCs w:val="30"/>
+          <w:rtl/>
+        </w:rPr>
+        <w:t xml:space="preserve"> اس سریے کے نام کی وجہ یہ بیان کی گئی ہے کہ مشرکین نے اس خوف سے اپنے آپ کو ایک دوسرے کے ساتھ باندھ لیا تھا کہ جنگ کے وقت بھاگ نہ جائیں، اور یہ بھی کہا جاتا ہے کہ وہاں "سلسل" نام کا ایک پانی تھا جو وادی القریٰ کے پیچھے مدینہ منورہ سے دس دن کے راستے پر ہے۔</w:t>
+      </w:r>
+      <w:r>
+        <w:rPr>
+          <w:rStyle w:val="FootnoteReference"/>
+        </w:rPr>
+        <w:footnoteReference w:id="198"/>
       </w:r>
       <w:r>
         <w:rPr>
@@ -18432,7 +18531,7 @@
         <w:rPr>
           <w:rStyle w:val="FootnoteReference"/>
         </w:rPr>
-        <w:footnoteReference w:id="194"/>
+        <w:footnoteReference w:id="199"/>
       </w:r>
       <w:r>
         <w:rPr>
@@ -18447,7 +18546,7 @@
         <w:rPr>
           <w:rStyle w:val="FootnoteReference"/>
         </w:rPr>
-        <w:footnoteReference w:id="195"/>
+        <w:footnoteReference w:id="200"/>
       </w:r>
     </w:p>
     <w:p>
@@ -18490,7 +18589,7 @@
         <w:rPr>
           <w:rStyle w:val="FootnoteReference"/>
         </w:rPr>
-        <w:footnoteReference w:id="196"/>
+        <w:footnoteReference w:id="201"/>
       </w:r>
       <w:r>
         <w:rPr>
@@ -18505,7 +18604,7 @@
         <w:rPr>
           <w:rStyle w:val="FootnoteReference"/>
         </w:rPr>
-        <w:footnoteReference w:id="197"/>
+        <w:footnoteReference w:id="202"/>
       </w:r>
     </w:p>
     <w:p>
@@ -18548,7 +18647,7 @@
         <w:rPr>
           <w:rStyle w:val="FootnoteReference"/>
         </w:rPr>
-        <w:footnoteReference w:id="198"/>
+        <w:footnoteReference w:id="203"/>
       </w:r>
       <w:r>
         <w:rPr>
@@ -18600,7 +18699,7 @@
         <w:rPr>
           <w:rStyle w:val="FootnoteReference"/>
         </w:rPr>
-        <w:footnoteReference w:id="199"/>
+        <w:footnoteReference w:id="204"/>
       </w:r>
     </w:p>
     <w:p>
@@ -18643,7 +18742,7 @@
         <w:rPr>
           <w:rStyle w:val="FootnoteReference"/>
         </w:rPr>
-        <w:footnoteReference w:id="200"/>
+        <w:footnoteReference w:id="205"/>
       </w:r>
       <w:r>
         <w:rPr>
@@ -18658,7 +18757,7 @@
         <w:rPr>
           <w:rStyle w:val="FootnoteReference"/>
         </w:rPr>
-        <w:footnoteReference w:id="201"/>
+        <w:footnoteReference w:id="206"/>
       </w:r>
       <w:r>
         <w:rPr>
@@ -18710,7 +18809,7 @@
         <w:rPr>
           <w:rStyle w:val="FootnoteReference"/>
         </w:rPr>
-        <w:footnoteReference w:id="202"/>
+        <w:footnoteReference w:id="207"/>
       </w:r>
       <w:r>
         <w:rPr>
@@ -18725,7 +18824,7 @@
         <w:rPr>
           <w:rStyle w:val="FootnoteReference"/>
         </w:rPr>
-        <w:footnoteReference w:id="203"/>
+        <w:footnoteReference w:id="208"/>
       </w:r>
     </w:p>
     <w:p>
@@ -18767,7 +18866,7 @@
         <w:rPr>
           <w:rStyle w:val="FootnoteReference"/>
         </w:rPr>
-        <w:footnoteReference w:id="204"/>
+        <w:footnoteReference w:id="209"/>
       </w:r>
       <w:r>
         <w:rPr>
@@ -18782,7 +18881,7 @@
         <w:rPr>
           <w:rStyle w:val="FootnoteReference"/>
         </w:rPr>
-        <w:footnoteReference w:id="205"/>
+        <w:footnoteReference w:id="210"/>
       </w:r>
     </w:p>
     <w:p>
@@ -18805,7 +18904,7 @@
         <w:rPr>
           <w:rStyle w:val="FootnoteReference"/>
         </w:rPr>
-        <w:footnoteReference w:id="206"/>
+        <w:footnoteReference w:id="211"/>
       </w:r>
       <w:r>
         <w:rPr>
@@ -18820,7 +18919,7 @@
         <w:rPr>
           <w:rStyle w:val="FootnoteReference"/>
         </w:rPr>
-        <w:footnoteReference w:id="207"/>
+        <w:footnoteReference w:id="212"/>
       </w:r>
     </w:p>
     <w:p>
@@ -18843,7 +18942,7 @@
         <w:rPr>
           <w:rStyle w:val="FootnoteReference"/>
         </w:rPr>
-        <w:footnoteReference w:id="208"/>
+        <w:footnoteReference w:id="213"/>
       </w:r>
       <w:bookmarkStart w:name="hd26" w:id="1"/>
       <w:r>
@@ -18918,7 +19017,7 @@
         <w:rPr>
           <w:rStyle w:val="FootnoteReference"/>
         </w:rPr>
-        <w:footnoteReference w:id="209"/>
+        <w:footnoteReference w:id="214"/>
       </w:r>
       <w:r>
         <w:rPr>
@@ -18933,7 +19032,7 @@
         <w:rPr>
           <w:rStyle w:val="FootnoteReference"/>
         </w:rPr>
-        <w:footnoteReference w:id="210"/>
+        <w:footnoteReference w:id="215"/>
       </w:r>
     </w:p>
     <w:p>
@@ -18976,7 +19075,7 @@
         <w:rPr>
           <w:rStyle w:val="FootnoteReference"/>
         </w:rPr>
-        <w:footnoteReference w:id="211"/>
+        <w:footnoteReference w:id="216"/>
       </w:r>
       <w:r>
         <w:rPr>
@@ -19028,7 +19127,7 @@
         <w:rPr>
           <w:rStyle w:val="FootnoteReference"/>
         </w:rPr>
-        <w:footnoteReference w:id="212"/>
+        <w:footnoteReference w:id="217"/>
       </w:r>
       <w:r>
         <w:rPr>
@@ -19043,7 +19142,7 @@
         <w:rPr>
           <w:rStyle w:val="FootnoteReference"/>
         </w:rPr>
-        <w:footnoteReference w:id="213"/>
+        <w:footnoteReference w:id="218"/>
       </w:r>
     </w:p>
     <w:p>
@@ -19086,7 +19185,7 @@
         <w:rPr>
           <w:rStyle w:val="FootnoteReference"/>
         </w:rPr>
-        <w:footnoteReference w:id="214"/>
+        <w:footnoteReference w:id="219"/>
       </w:r>
     </w:p>
     <w:p>
@@ -19129,7 +19228,7 @@
         <w:rPr>
           <w:rStyle w:val="FootnoteReference"/>
         </w:rPr>
-        <w:footnoteReference w:id="215"/>
+        <w:footnoteReference w:id="220"/>
       </w:r>
       <w:r>
         <w:rPr>
@@ -19144,7 +19243,7 @@
         <w:rPr>
           <w:rStyle w:val="FootnoteReference"/>
         </w:rPr>
-        <w:footnoteReference w:id="216"/>
+        <w:footnoteReference w:id="221"/>
       </w:r>
     </w:p>
     <w:p>
@@ -19187,7 +19286,7 @@
         <w:rPr>
           <w:rStyle w:val="FootnoteReference"/>
         </w:rPr>
-        <w:footnoteReference w:id="217"/>
+        <w:footnoteReference w:id="222"/>
       </w:r>
       <w:r>
         <w:rPr>
@@ -19202,7 +19301,7 @@
         <w:rPr>
           <w:rStyle w:val="FootnoteReference"/>
         </w:rPr>
-        <w:footnoteReference w:id="218"/>
+        <w:footnoteReference w:id="223"/>
       </w:r>
     </w:p>
     <w:p>
@@ -19245,7 +19344,7 @@
         <w:rPr>
           <w:rStyle w:val="FootnoteReference"/>
         </w:rPr>
-        <w:footnoteReference w:id="219"/>
+        <w:footnoteReference w:id="224"/>
       </w:r>
     </w:p>
     <w:p>
@@ -19288,7 +19387,7 @@
         <w:rPr>
           <w:rStyle w:val="FootnoteReference"/>
         </w:rPr>
-        <w:footnoteReference w:id="220"/>
+        <w:footnoteReference w:id="225"/>
       </w:r>
       <w:r>
         <w:rPr>
@@ -19303,7 +19402,7 @@
         <w:rPr>
           <w:rStyle w:val="FootnoteReference"/>
         </w:rPr>
-        <w:footnoteReference w:id="221"/>
+        <w:footnoteReference w:id="226"/>
       </w:r>
     </w:p>
     <w:p>
@@ -19343,7 +19442,7 @@
         <w:rPr>
           <w:rStyle w:val="FootnoteReference"/>
         </w:rPr>
-        <w:footnoteReference w:id="222"/>
+        <w:footnoteReference w:id="227"/>
       </w:r>
       <w:bookmarkStart w:name="hd27" w:id="1"/>
       <w:r>
@@ -19371,7 +19470,7 @@
         <w:rPr>
           <w:rStyle w:val="FootnoteReference"/>
         </w:rPr>
-        <w:footnoteReference w:id="223"/>
+        <w:footnoteReference w:id="228"/>
       </w:r>
       <w:r>
         <w:rPr>
@@ -19386,7 +19485,7 @@
         <w:rPr>
           <w:rStyle w:val="FootnoteReference"/>
         </w:rPr>
-        <w:footnoteReference w:id="224"/>
+        <w:footnoteReference w:id="229"/>
       </w:r>
       <w:r>
         <w:rPr>
@@ -19401,7 +19500,7 @@
         <w:rPr>
           <w:rStyle w:val="FootnoteReference"/>
         </w:rPr>
-        <w:footnoteReference w:id="225"/>
+        <w:footnoteReference w:id="230"/>
       </w:r>
       <w:r>
         <w:rPr>
@@ -19416,7 +19515,7 @@
         <w:rPr>
           <w:rStyle w:val="FootnoteReference"/>
         </w:rPr>
-        <w:footnoteReference w:id="226"/>
+        <w:footnoteReference w:id="231"/>
       </w:r>
     </w:p>
     <w:p>
@@ -20774,7 +20873,7 @@
                 <w:szCs w:val="24"/>
                 <w:rtl/>
               </w:rPr>
-              <w:t xml:space="preserve">8ھ</w:t>
+              <w:t xml:space="preserve">جمادی الآخرہ 8ھ</w:t>
             </w:r>
           </w:p>
         </w:tc>
@@ -20830,7 +20929,7 @@
                 <w:szCs w:val="24"/>
                 <w:rtl/>
               </w:rPr>
-              <w:t xml:space="preserve">300 اور کمک</w:t>
+              <w:t xml:space="preserve">300 + 200</w:t>
             </w:r>
           </w:p>
         </w:tc>
@@ -23309,7 +23408,7 @@
           <w:szCs w:val="30"/>
           <w:rtl/>
         </w:rPr>
-        <w:t xml:space="preserve">یہ جدول المواہب اللدنیہ (ج1، ص389 تا 490) اور مدارج النبوۃ (ج2، ص322 تا 477) کی تفصیلات سے راقم نے مرتب کیا ہے۔</w:t>
+        <w:t xml:space="preserve">یہ جدول المواہب اللدنیہ (ج1، ص389 تا 490)، سیرتِ محمدیہ ترجمہ مواہبِ لدنیہ (ص397) اور مدارج النبوۃ (ج2، ص322 تا 477) کی تفصیلات سے راقم نے مرتب کیا ہے۔</w:t>
       </w:r>
     </w:p>
     <w:p>
@@ -23352,7 +23451,7 @@
         <w:rPr>
           <w:rStyle w:val="FootnoteReference"/>
         </w:rPr>
-        <w:footnoteReference w:id="227"/>
+        <w:footnoteReference w:id="232"/>
       </w:r>
       <w:r>
         <w:rPr>
@@ -23367,7 +23466,7 @@
         <w:rPr>
           <w:rStyle w:val="FootnoteReference"/>
         </w:rPr>
-        <w:footnoteReference w:id="228"/>
+        <w:footnoteReference w:id="233"/>
       </w:r>
     </w:p>
     <w:p>
@@ -24468,7 +24567,7 @@
         <w:rPr>
           <w:rStyle w:val="FootnoteReference"/>
         </w:rPr>
-        <w:footnoteReference w:id="229"/>
+        <w:footnoteReference w:id="234"/>
       </w:r>
     </w:p>
     <w:p>
@@ -25416,7 +25515,7 @@
         <w:rPr>
           <w:rStyle w:val="FootnoteReference"/>
         </w:rPr>
-        <w:footnoteReference w:id="230"/>
+        <w:footnoteReference w:id="235"/>
       </w:r>
       <w:r>
         <w:rPr>
@@ -25468,7 +25567,7 @@
         <w:rPr>
           <w:rStyle w:val="FootnoteReference"/>
         </w:rPr>
-        <w:footnoteReference w:id="231"/>
+        <w:footnoteReference w:id="236"/>
       </w:r>
       <w:r>
         <w:rPr>
@@ -25520,7 +25619,7 @@
         <w:rPr>
           <w:rStyle w:val="FootnoteReference"/>
         </w:rPr>
-        <w:footnoteReference w:id="232"/>
+        <w:footnoteReference w:id="237"/>
       </w:r>
       <w:r>
         <w:rPr>
@@ -25572,7 +25671,7 @@
         <w:rPr>
           <w:rStyle w:val="FootnoteReference"/>
         </w:rPr>
-        <w:footnoteReference w:id="233"/>
+        <w:footnoteReference w:id="238"/>
       </w:r>
     </w:p>
     <w:p>
@@ -25615,7 +25714,7 @@
         <w:rPr>
           <w:rStyle w:val="FootnoteReference"/>
         </w:rPr>
-        <w:footnoteReference w:id="234"/>
+        <w:footnoteReference w:id="239"/>
       </w:r>
       <w:r>
         <w:rPr>
@@ -25630,7 +25729,7 @@
         <w:rPr>
           <w:rStyle w:val="FootnoteReference"/>
         </w:rPr>
-        <w:footnoteReference w:id="235"/>
+        <w:footnoteReference w:id="240"/>
       </w:r>
     </w:p>
     <w:p>
@@ -25690,7 +25789,7 @@
         <w:rPr>
           <w:rStyle w:val="FootnoteReference"/>
         </w:rPr>
-        <w:footnoteReference w:id="236"/>
+        <w:footnoteReference w:id="241"/>
       </w:r>
       <w:r>
         <w:rPr>
@@ -25705,7 +25804,7 @@
         <w:rPr>
           <w:rStyle w:val="FootnoteReference"/>
         </w:rPr>
-        <w:footnoteReference w:id="237"/>
+        <w:footnoteReference w:id="242"/>
       </w:r>
       <w:r>
         <w:rPr>
@@ -25720,7 +25819,7 @@
         <w:rPr>
           <w:rStyle w:val="FootnoteReference"/>
         </w:rPr>
-        <w:footnoteReference w:id="238"/>
+        <w:footnoteReference w:id="243"/>
       </w:r>
     </w:p>
     <w:p>
@@ -25757,13 +25856,28 @@
           <w:szCs w:val="30"/>
           <w:rtl/>
         </w:rPr>
-        <w:t xml:space="preserve">سریہ ذات السلاسل اطاعتِ امیر اور اتحاد کی ایک روشن مثال ہے۔ جب حضرت ابو عبیدہ بن جراح رضی اللہ عنہ کمک لے کر پہنچے، جس میں حضرت ابوبکر اور حضرت عمر رضی اللہ عنہما جیسے اکابر بھی شامل تھے، تو امامت اور امارت کا سوال پیدا ہوا۔ شیخ محقق کے مطابق رسول اللہ ﷺ نے روانگی کے وقت حضرت ابو عبیدہ کو نصیحت فرمائی تھی کہ جب یکجا ہو جاؤ تو تمام امور میں متفق ہو جانا اور اختلاف نہ کرنا؛ چنانچہ جب نماز کا وقت آیا اور حضرت عمرو بن العاص رضی اللہ عنہ نے کہا کہ میں امیر ہوں، تو حضرت ابو عبیدہ رضی اللہ عنہ کو حضور ﷺ کی نصیحت یاد آئی، وہ مخالفت سے باز آ گئے اور ان کے پیچھے نماز پڑھی؛ اور فرمایا کہ اگر تم مخالفت کرو گے تو بھی میں تمہاری اطاعت کروں گا۔</w:t>
-      </w:r>
-      <w:r>
-        <w:rPr>
-          <w:rStyle w:val="FootnoteReference"/>
-        </w:rPr>
-        <w:footnoteReference w:id="239"/>
+        <w:t xml:space="preserve">سریہ ذات السلاسل اطاعتِ امیر اور اتحاد کی ایک روشن مثال ہے۔ جب حضرت ابو عبیدہ بن جراح رضی اللہ عنہ دو سو مجاہدین کی کمک لے کر پہنچے، جس میں حضرت ابوبکر اور حضرت عمر رضی اللہ عنہما جیسے اکابر بھی شامل تھے، تو امامت اور امارت کا سوال پیدا ہوا۔</w:t>
+      </w:r>
+      <w:r>
+        <w:rPr>
+          <w:rStyle w:val="FootnoteReference"/>
+        </w:rPr>
+        <w:footnoteReference w:id="244"/>
+      </w:r>
+      <w:r>
+        <w:rPr>
+          <w:rFonts w:ascii="Jameel Noori Nastaleeq" w:cs="Jameel Noori Nastaleeq" w:eastAsia="Jameel Noori Nastaleeq" w:hAnsi="Jameel Noori Nastaleeq"/>
+          <w:sz w:val="30"/>
+          <w:szCs w:val="30"/>
+          <w:rtl/>
+        </w:rPr>
+        <w:t xml:space="preserve"> شیخ محقق کے مطابق رسول اللہ ﷺ نے روانگی کے وقت حضرت ابو عبیدہ کو نصیحت فرمائی تھی کہ جب یکجا ہو جاؤ تو تمام امور میں متفق ہو جانا اور اختلاف نہ کرنا؛ چنانچہ جب نماز کا وقت آیا اور حضرت عمرو بن العاص رضی اللہ عنہ نے کہا کہ میں امیر ہوں، تو حضرت ابو عبیدہ رضی اللہ عنہ کو حضور ﷺ کی نصیحت یاد آئی، وہ مخالفت سے باز آ گئے اور ان کے پیچھے نماز پڑھی؛ اور فرمایا کہ اگر تم مخالفت کرو گے تو بھی میں تمہاری اطاعت کروں گا۔</w:t>
+      </w:r>
+      <w:r>
+        <w:rPr>
+          <w:rStyle w:val="FootnoteReference"/>
+        </w:rPr>
+        <w:footnoteReference w:id="245"/>
       </w:r>
       <w:bookmarkStart w:name="hd28" w:id="1"/>
       <w:r>
@@ -25791,7 +25905,7 @@
         <w:rPr>
           <w:rStyle w:val="FootnoteReference"/>
         </w:rPr>
-        <w:footnoteReference w:id="240"/>
+        <w:footnoteReference w:id="246"/>
       </w:r>
       <w:r>
         <w:rPr>
@@ -25823,7 +25937,7 @@
         <w:rPr>
           <w:rStyle w:val="FootnoteReference"/>
         </w:rPr>
-        <w:footnoteReference w:id="241"/>
+        <w:footnoteReference w:id="247"/>
       </w:r>
       <w:r>
         <w:rPr>
@@ -25912,7 +26026,7 @@
         <w:rPr>
           <w:rStyle w:val="FootnoteReference"/>
         </w:rPr>
-        <w:footnoteReference w:id="242"/>
+        <w:footnoteReference w:id="248"/>
       </w:r>
       <w:r>
         <w:rPr>
@@ -25964,7 +26078,7 @@
         <w:rPr>
           <w:rStyle w:val="FootnoteReference"/>
         </w:rPr>
-        <w:footnoteReference w:id="243"/>
+        <w:footnoteReference w:id="249"/>
       </w:r>
     </w:p>
     <w:p>
@@ -26024,7 +26138,7 @@
         <w:rPr>
           <w:rStyle w:val="FootnoteReference"/>
         </w:rPr>
-        <w:footnoteReference w:id="244"/>
+        <w:footnoteReference w:id="250"/>
       </w:r>
       <w:r>
         <w:rPr>
@@ -26056,7 +26170,7 @@
         <w:rPr>
           <w:rStyle w:val="FootnoteReference"/>
         </w:rPr>
-        <w:footnoteReference w:id="245"/>
+        <w:footnoteReference w:id="251"/>
       </w:r>
     </w:p>
     <w:p>
@@ -26079,7 +26193,7 @@
         <w:rPr>
           <w:rStyle w:val="FootnoteReference"/>
         </w:rPr>
-        <w:footnoteReference w:id="246"/>
+        <w:footnoteReference w:id="252"/>
       </w:r>
     </w:p>
     <w:p>
@@ -26102,7 +26216,7 @@
         <w:rPr>
           <w:rStyle w:val="FootnoteReference"/>
         </w:rPr>
-        <w:footnoteReference w:id="247"/>
+        <w:footnoteReference w:id="253"/>
       </w:r>
     </w:p>
     <w:p>
@@ -26125,7 +26239,7 @@
         <w:rPr>
           <w:rStyle w:val="FootnoteReference"/>
         </w:rPr>
-        <w:footnoteReference w:id="248"/>
+        <w:footnoteReference w:id="254"/>
       </w:r>
       <w:r>
         <w:rPr>
@@ -26140,7 +26254,7 @@
         <w:rPr>
           <w:rStyle w:val="FootnoteReference"/>
         </w:rPr>
-        <w:footnoteReference w:id="249"/>
+        <w:footnoteReference w:id="255"/>
       </w:r>
     </w:p>
     <w:p>
@@ -26163,7 +26277,7 @@
         <w:rPr>
           <w:rStyle w:val="FootnoteReference"/>
         </w:rPr>
-        <w:footnoteReference w:id="250"/>
+        <w:footnoteReference w:id="256"/>
       </w:r>
       <w:r>
         <w:rPr>
@@ -26178,7 +26292,7 @@
         <w:rPr>
           <w:rStyle w:val="FootnoteReference"/>
         </w:rPr>
-        <w:footnoteReference w:id="251"/>
+        <w:footnoteReference w:id="257"/>
       </w:r>
       <w:r>
         <w:rPr>
@@ -26224,13 +26338,13 @@
           <w:szCs w:val="30"/>
           <w:rtl/>
         </w:rPr>
-        <w:t xml:space="preserve">بہت سے سرایا میں رات کو سفر کرنے اور دن کو چھپ کر رہنے کا طریقہ اختیار کیا گیا، جیسے سریہ حسمیٰ، سریہ فدک، سریہ تربہ اور سریہ عیینہ بن حصن میں۔</w:t>
-      </w:r>
-      <w:r>
-        <w:rPr>
-          <w:rStyle w:val="FootnoteReference"/>
-        </w:rPr>
-        <w:footnoteReference w:id="252"/>
+        <w:t xml:space="preserve">بہت سے سرایا میں رات کو سفر کرنے اور دن کو چھپ کر رہنے کا طریقہ اختیار کیا گیا، جیسے سریہ حسمیٰ، سریہ فدک، سریہ تربہ، سریہ عیینہ بن حصن اور سریہ ذات السلاسل میں۔</w:t>
+      </w:r>
+      <w:r>
+        <w:rPr>
+          <w:rStyle w:val="FootnoteReference"/>
+        </w:rPr>
+        <w:footnoteReference w:id="258"/>
       </w:r>
       <w:r>
         <w:rPr>
@@ -26245,7 +26359,7 @@
         <w:rPr>
           <w:rStyle w:val="FootnoteReference"/>
         </w:rPr>
-        <w:footnoteReference w:id="253"/>
+        <w:footnoteReference w:id="259"/>
       </w:r>
       <w:r>
         <w:rPr>
@@ -26334,7 +26448,7 @@
         <w:rPr>
           <w:rStyle w:val="FootnoteReference"/>
         </w:rPr>
-        <w:footnoteReference w:id="254"/>
+        <w:footnoteReference w:id="260"/>
       </w:r>
     </w:p>
     <w:p>
@@ -26414,7 +26528,7 @@
         <w:rPr>
           <w:rStyle w:val="FootnoteReference"/>
         </w:rPr>
-        <w:footnoteReference w:id="255"/>
+        <w:footnoteReference w:id="261"/>
       </w:r>
       <w:r>
         <w:rPr>
@@ -26446,7 +26560,7 @@
         <w:rPr>
           <w:rStyle w:val="FootnoteReference"/>
         </w:rPr>
-        <w:footnoteReference w:id="256"/>
+        <w:footnoteReference w:id="262"/>
       </w:r>
     </w:p>
     <w:p>
@@ -26489,7 +26603,7 @@
         <w:rPr>
           <w:rStyle w:val="FootnoteReference"/>
         </w:rPr>
-        <w:footnoteReference w:id="257"/>
+        <w:footnoteReference w:id="263"/>
       </w:r>
       <w:r>
         <w:rPr>
@@ -26504,7 +26618,7 @@
         <w:rPr>
           <w:rStyle w:val="FootnoteReference"/>
         </w:rPr>
-        <w:footnoteReference w:id="258"/>
+        <w:footnoteReference w:id="264"/>
       </w:r>
       <w:r>
         <w:rPr>
@@ -26519,7 +26633,7 @@
         <w:rPr>
           <w:rStyle w:val="FootnoteReference"/>
         </w:rPr>
-        <w:footnoteReference w:id="259"/>
+        <w:footnoteReference w:id="265"/>
       </w:r>
       <w:r>
         <w:rPr>
@@ -26588,7 +26702,7 @@
         <w:rPr>
           <w:rStyle w:val="FootnoteReference"/>
         </w:rPr>
-        <w:footnoteReference w:id="260"/>
+        <w:footnoteReference w:id="266"/>
       </w:r>
     </w:p>
     <w:p>
@@ -26611,7 +26725,7 @@
         <w:rPr>
           <w:rStyle w:val="FootnoteReference"/>
         </w:rPr>
-        <w:footnoteReference w:id="261"/>
+        <w:footnoteReference w:id="267"/>
       </w:r>
     </w:p>
     <w:p>
@@ -26634,7 +26748,7 @@
         <w:rPr>
           <w:rStyle w:val="FootnoteReference"/>
         </w:rPr>
-        <w:footnoteReference w:id="262"/>
+        <w:footnoteReference w:id="268"/>
       </w:r>
     </w:p>
     <w:p>
@@ -26657,7 +26771,7 @@
         <w:rPr>
           <w:rStyle w:val="FootnoteReference"/>
         </w:rPr>
-        <w:footnoteReference w:id="263"/>
+        <w:footnoteReference w:id="269"/>
       </w:r>
       <w:r>
         <w:rPr>
@@ -26745,7 +26859,7 @@
         <w:rPr>
           <w:rStyle w:val="FootnoteReference"/>
         </w:rPr>
-        <w:footnoteReference w:id="264"/>
+        <w:footnoteReference w:id="270"/>
       </w:r>
     </w:p>
     <w:p>
@@ -27820,7 +27934,7 @@
         <w:rPr>
           <w:rStyle w:val="FootnoteReference"/>
         </w:rPr>
-        <w:footnoteReference w:id="265"/>
+        <w:footnoteReference w:id="271"/>
       </w:r>
     </w:p>
     <w:p>
@@ -27907,7 +28021,7 @@
         <w:rPr>
           <w:rStyle w:val="FootnoteReference"/>
         </w:rPr>
-        <w:footnoteReference w:id="266"/>
+        <w:footnoteReference w:id="272"/>
       </w:r>
       <w:bookmarkStart w:name="hd30" w:id="1"/>
       <w:r>
@@ -27935,7 +28049,7 @@
         <w:rPr>
           <w:rStyle w:val="FootnoteReference"/>
         </w:rPr>
-        <w:footnoteReference w:id="267"/>
+        <w:footnoteReference w:id="273"/>
       </w:r>
     </w:p>
     <w:p>
@@ -27995,7 +28109,7 @@
         <w:rPr>
           <w:rStyle w:val="FootnoteReference"/>
         </w:rPr>
-        <w:footnoteReference w:id="268"/>
+        <w:footnoteReference w:id="274"/>
       </w:r>
       <w:r>
         <w:rPr>
@@ -28027,7 +28141,7 @@
         <w:rPr>
           <w:rStyle w:val="FootnoteReference"/>
         </w:rPr>
-        <w:footnoteReference w:id="269"/>
+        <w:footnoteReference w:id="275"/>
       </w:r>
       <w:bookmarkStart w:name="hd31" w:id="1"/>
       <w:r>
@@ -28075,7 +28189,7 @@
         <w:rPr>
           <w:rStyle w:val="FootnoteReference"/>
         </w:rPr>
-        <w:footnoteReference w:id="270"/>
+        <w:footnoteReference w:id="276"/>
       </w:r>
       <w:r>
         <w:rPr>
@@ -28107,7 +28221,7 @@
         <w:rPr>
           <w:rStyle w:val="FootnoteReference"/>
         </w:rPr>
-        <w:footnoteReference w:id="271"/>
+        <w:footnoteReference w:id="277"/>
       </w:r>
       <w:bookmarkStart w:name="hd32" w:id="1"/>
       <w:r>
@@ -28135,7 +28249,7 @@
         <w:rPr>
           <w:rStyle w:val="FootnoteReference"/>
         </w:rPr>
-        <w:footnoteReference w:id="272"/>
+        <w:footnoteReference w:id="278"/>
       </w:r>
       <w:r>
         <w:rPr>
@@ -29294,7 +29408,7 @@
         <w:rPr>
           <w:rStyle w:val="FootnoteReference"/>
         </w:rPr>
-        <w:footnoteReference w:id="273"/>
+        <w:footnoteReference w:id="279"/>
       </w:r>
     </w:p>
     <w:p>
@@ -29336,7 +29450,7 @@
         <w:rPr>
           <w:rStyle w:val="FootnoteReference"/>
         </w:rPr>
-        <w:footnoteReference w:id="274"/>
+        <w:footnoteReference w:id="280"/>
       </w:r>
       <w:bookmarkStart w:name="hd33" w:id="1"/>
       <w:r>
@@ -29356,7 +29470,7 @@
         <w:rPr>
           <w:rStyle w:val="FootnoteReference"/>
         </w:rPr>
-        <w:footnoteReference w:id="275"/>
+        <w:footnoteReference w:id="281"/>
       </w:r>
       <w:r>
         <w:rPr>
@@ -29407,7 +29521,7 @@
         <w:rPr>
           <w:rStyle w:val="FootnoteReference"/>
         </w:rPr>
-        <w:footnoteReference w:id="276"/>
+        <w:footnoteReference w:id="282"/>
       </w:r>
       <w:r>
         <w:rPr>
@@ -29422,7 +29536,7 @@
         <w:rPr>
           <w:rStyle w:val="FootnoteReference"/>
         </w:rPr>
-        <w:footnoteReference w:id="277"/>
+        <w:footnoteReference w:id="283"/>
       </w:r>
       <w:r>
         <w:rPr>
@@ -29437,7 +29551,7 @@
         <w:rPr>
           <w:rStyle w:val="FootnoteReference"/>
         </w:rPr>
-        <w:footnoteReference w:id="278"/>
+        <w:footnoteReference w:id="284"/>
       </w:r>
     </w:p>
     <w:p>
@@ -29465,7 +29579,7 @@
         <w:rPr>
           <w:rStyle w:val="FootnoteReference"/>
         </w:rPr>
-        <w:footnoteReference w:id="279"/>
+        <w:footnoteReference w:id="285"/>
       </w:r>
     </w:p>
     <w:p>
@@ -29515,7 +29629,7 @@
         <w:rPr>
           <w:rStyle w:val="FootnoteReference"/>
         </w:rPr>
-        <w:footnoteReference w:id="280"/>
+        <w:footnoteReference w:id="286"/>
       </w:r>
       <w:bookmarkStart w:name="hd35" w:id="1"/>
       <w:r>
@@ -29571,7 +29685,7 @@
         <w:rPr>
           <w:rStyle w:val="FootnoteReference"/>
         </w:rPr>
-        <w:footnoteReference w:id="281"/>
+        <w:footnoteReference w:id="287"/>
       </w:r>
       <w:r>
         <w:rPr>
@@ -29630,7 +29744,7 @@
         <w:rPr>
           <w:rStyle w:val="FootnoteReference"/>
         </w:rPr>
-        <w:footnoteReference w:id="282"/>
+        <w:footnoteReference w:id="288"/>
       </w:r>
       <w:bookmarkStart w:name="hd36" w:id="1"/>
       <w:r>
@@ -29658,7 +29772,7 @@
         <w:rPr>
           <w:rStyle w:val="FootnoteReference"/>
         </w:rPr>
-        <w:footnoteReference w:id="283"/>
+        <w:footnoteReference w:id="289"/>
       </w:r>
     </w:p>
     <w:p>
@@ -29681,7 +29795,7 @@
         <w:rPr>
           <w:rStyle w:val="FootnoteReference"/>
         </w:rPr>
-        <w:footnoteReference w:id="284"/>
+        <w:footnoteReference w:id="290"/>
       </w:r>
       <w:r>
         <w:rPr>
@@ -29696,7 +29810,7 @@
         <w:rPr>
           <w:rStyle w:val="FootnoteReference"/>
         </w:rPr>
-        <w:footnoteReference w:id="285"/>
+        <w:footnoteReference w:id="291"/>
       </w:r>
     </w:p>
     <w:p>
@@ -29755,7 +29869,7 @@
         <w:rPr>
           <w:rStyle w:val="FootnoteReference"/>
         </w:rPr>
-        <w:footnoteReference w:id="286"/>
+        <w:footnoteReference w:id="292"/>
       </w:r>
     </w:p>
     <w:p>
@@ -29797,7 +29911,7 @@
         <w:rPr>
           <w:rStyle w:val="FootnoteReference"/>
         </w:rPr>
-        <w:footnoteReference w:id="287"/>
+        <w:footnoteReference w:id="293"/>
       </w:r>
       <w:r>
         <w:rPr>
@@ -29812,7 +29926,7 @@
         <w:rPr>
           <w:rStyle w:val="FootnoteReference"/>
         </w:rPr>
-        <w:footnoteReference w:id="288"/>
+        <w:footnoteReference w:id="294"/>
       </w:r>
     </w:p>
     <w:p>
@@ -29872,7 +29986,7 @@
         <w:rPr>
           <w:rStyle w:val="FootnoteReference"/>
         </w:rPr>
-        <w:footnoteReference w:id="289"/>
+        <w:footnoteReference w:id="295"/>
       </w:r>
     </w:p>
     <w:p>
@@ -29895,7 +30009,7 @@
         <w:rPr>
           <w:rStyle w:val="FootnoteReference"/>
         </w:rPr>
-        <w:footnoteReference w:id="290"/>
+        <w:footnoteReference w:id="296"/>
       </w:r>
     </w:p>
     <w:p>
@@ -29918,7 +30032,7 @@
         <w:rPr>
           <w:rStyle w:val="FootnoteReference"/>
         </w:rPr>
-        <w:footnoteReference w:id="291"/>
+        <w:footnoteReference w:id="297"/>
       </w:r>
     </w:p>
     <w:p>
@@ -30129,7 +30243,7 @@
         <w:rPr>
           <w:rStyle w:val="FootnoteReference"/>
         </w:rPr>
-        <w:footnoteReference w:id="292"/>
+        <w:footnoteReference w:id="298"/>
       </w:r>
       <w:r>
         <w:rPr>
@@ -30198,7 +30312,7 @@
         <w:rPr>
           <w:rStyle w:val="FootnoteReference"/>
         </w:rPr>
-        <w:footnoteReference w:id="293"/>
+        <w:footnoteReference w:id="299"/>
       </w:r>
     </w:p>
     <w:p>
@@ -30221,7 +30335,7 @@
         <w:rPr>
           <w:rStyle w:val="FootnoteReference"/>
         </w:rPr>
-        <w:footnoteReference w:id="294"/>
+        <w:footnoteReference w:id="300"/>
       </w:r>
     </w:p>
     <w:p>
@@ -30261,7 +30375,7 @@
         <w:rPr>
           <w:rStyle w:val="FootnoteReference"/>
         </w:rPr>
-        <w:footnoteReference w:id="295"/>
+        <w:footnoteReference w:id="301"/>
       </w:r>
     </w:p>
     <w:p>
@@ -30358,7 +30472,7 @@
         <w:rPr>
           <w:rStyle w:val="FootnoteReference"/>
         </w:rPr>
-        <w:footnoteReference w:id="296"/>
+        <w:footnoteReference w:id="302"/>
       </w:r>
       <w:r>
         <w:rPr>
@@ -30410,7 +30524,7 @@
         <w:rPr>
           <w:rStyle w:val="FootnoteReference"/>
         </w:rPr>
-        <w:footnoteReference w:id="297"/>
+        <w:footnoteReference w:id="303"/>
       </w:r>
     </w:p>
     <w:p>
@@ -30453,7 +30567,7 @@
         <w:rPr>
           <w:rStyle w:val="FootnoteReference"/>
         </w:rPr>
-        <w:footnoteReference w:id="298"/>
+        <w:footnoteReference w:id="304"/>
       </w:r>
       <w:r>
         <w:rPr>
@@ -30764,7 +30878,7 @@
         <w:rPr>
           <w:rStyle w:val="FootnoteReference"/>
         </w:rPr>
-        <w:footnoteReference w:id="299"/>
+        <w:footnoteReference w:id="305"/>
       </w:r>
       <w:r>
         <w:rPr>
@@ -30890,7 +31004,7 @@
         <w:rPr>
           <w:rStyle w:val="FootnoteReference"/>
         </w:rPr>
-        <w:footnoteReference w:id="300"/>
+        <w:footnoteReference w:id="306"/>
       </w:r>
       <w:r>
         <w:rPr>
@@ -31016,7 +31130,7 @@
         <w:rPr>
           <w:rStyle w:val="FootnoteReference"/>
         </w:rPr>
-        <w:footnoteReference w:id="301"/>
+        <w:footnoteReference w:id="307"/>
       </w:r>
     </w:p>
     <w:p>
@@ -31691,15 +31805,6 @@
         </w:tc>
       </w:tr>
     </w:tbl>
-    <w:p>
-      <w:r>
-        <w:rPr>
-          <w:sz w:val="30"/>
-          <w:szCs w:val="30"/>
-        </w:rPr>
-        <w:t xml:space="preserve"/>
-      </w:r>
-    </w:p>
     <w:p>
       <w:pPr>
         <w:keepNext/>
@@ -37112,7 +37217,7 @@
                 <w:szCs w:val="24"/>
                 <w:rtl/>
               </w:rPr>
-              <w:t xml:space="preserve">مدارج النبوۃ (اردو)، جلد دوم</w:t>
+              <w:t xml:space="preserve">سیرتِ محمدیہ ترجمہ مواہبِ لدنیہ (اردو)، اول</w:t>
             </w:r>
           </w:p>
         </w:tc>
@@ -37140,7 +37245,7 @@
                 <w:szCs w:val="24"/>
                 <w:rtl/>
               </w:rPr>
-              <w:t xml:space="preserve">شیخ عبدالحق محدث دہلوی؛ مترجم: مفتی غلام معین الدین نعیمی</w:t>
+              <w:t xml:space="preserve">امام احمد بن محمد قسطلانی؛ ترتیب و تدوین: محمد عبدالستار طاہر مسعودی</w:t>
             </w:r>
           </w:p>
         </w:tc>
@@ -37168,7 +37273,7 @@
                 <w:szCs w:val="24"/>
                 <w:rtl/>
               </w:rPr>
-              <w:t xml:space="preserve">شبیر برادرز، اردو بازار، لاہور</w:t>
+              <w:t xml:space="preserve">شبیر برادرز، زبیدہ سنٹر، 40 اردو بازار، لاہور</w:t>
             </w:r>
           </w:p>
         </w:tc>
@@ -37196,7 +37301,7 @@
                 <w:szCs w:val="24"/>
                 <w:rtl/>
               </w:rPr>
-              <w:t xml:space="preserve">جولائی 2004ء</w:t>
+              <w:t xml:space="preserve">اشاعتِ اول اگست 2002ء</w:t>
             </w:r>
           </w:p>
         </w:tc>
@@ -37257,7 +37362,7 @@
                 <w:szCs w:val="24"/>
                 <w:rtl/>
               </w:rPr>
-              <w:t xml:space="preserve">الرحیق المختوم (اردو)</w:t>
+              <w:t xml:space="preserve">مدارج النبوۃ (اردو)، جلد دوم</w:t>
             </w:r>
           </w:p>
         </w:tc>
@@ -37285,7 +37390,7 @@
                 <w:szCs w:val="24"/>
                 <w:rtl/>
               </w:rPr>
-              <w:t xml:space="preserve">مولانا صفی الرحمٰن مبارکپوری</w:t>
+              <w:t xml:space="preserve">شیخ عبدالحق محدث دہلوی؛ مترجم: مفتی غلام معین الدین نعیمی</w:t>
             </w:r>
           </w:p>
         </w:tc>
@@ -37313,7 +37418,7 @@
                 <w:szCs w:val="24"/>
                 <w:rtl/>
               </w:rPr>
-              <w:t xml:space="preserve">المکتبۃ السلفیہ، شیش محل روڈ، لاہور</w:t>
+              <w:t xml:space="preserve">شبیر برادرز، اردو بازار، لاہور</w:t>
             </w:r>
           </w:p>
         </w:tc>
@@ -37341,7 +37446,7 @@
                 <w:szCs w:val="24"/>
                 <w:rtl/>
               </w:rPr>
-              <w:t xml:space="preserve">محرم الحرام 1421ھ/مئی 2000ء</w:t>
+              <w:t xml:space="preserve">جولائی 2004ء</w:t>
             </w:r>
           </w:p>
         </w:tc>
@@ -37375,6 +37480,151 @@
                 <w:rtl/>
               </w:rPr>
               <w:t xml:space="preserve">6</w:t>
+            </w:r>
+          </w:p>
+        </w:tc>
+        <w:tc>
+          <w:tcPr>
+            <w:tcW w:type="dxa" w:w="2500"/>
+            <w:tcMar>
+              <w:top w:type="dxa" w:w="30"/>
+              <w:left w:type="dxa" w:w="100"/>
+              <w:bottom w:type="dxa" w:w="30"/>
+              <w:right w:type="dxa" w:w="100"/>
+            </w:tcMar>
+            <w:vAlign w:val="center"/>
+          </w:tcPr>
+          <w:p>
+            <w:pPr>
+              <w:bidi/>
+              <w:spacing w:after="0" w:before="0" w:line="240" w:lineRule="auto"/>
+              <w:jc w:val="center"/>
+            </w:pPr>
+            <w:r>
+              <w:rPr>
+                <w:rFonts w:ascii="Jameel Noori Nastaleeq" w:cs="Jameel Noori Nastaleeq" w:eastAsia="Jameel Noori Nastaleeq" w:hAnsi="Jameel Noori Nastaleeq"/>
+                <w:sz w:val="24"/>
+                <w:szCs w:val="24"/>
+                <w:rtl/>
+              </w:rPr>
+              <w:t xml:space="preserve">الرحیق المختوم (اردو)</w:t>
+            </w:r>
+          </w:p>
+        </w:tc>
+        <w:tc>
+          <w:tcPr>
+            <w:tcW w:type="dxa" w:w="1900"/>
+            <w:tcMar>
+              <w:top w:type="dxa" w:w="30"/>
+              <w:left w:type="dxa" w:w="100"/>
+              <w:bottom w:type="dxa" w:w="30"/>
+              <w:right w:type="dxa" w:w="100"/>
+            </w:tcMar>
+            <w:vAlign w:val="center"/>
+          </w:tcPr>
+          <w:p>
+            <w:pPr>
+              <w:bidi/>
+              <w:spacing w:after="0" w:before="0" w:line="240" w:lineRule="auto"/>
+              <w:jc w:val="center"/>
+            </w:pPr>
+            <w:r>
+              <w:rPr>
+                <w:rFonts w:ascii="Jameel Noori Nastaleeq" w:cs="Jameel Noori Nastaleeq" w:eastAsia="Jameel Noori Nastaleeq" w:hAnsi="Jameel Noori Nastaleeq"/>
+                <w:sz w:val="24"/>
+                <w:szCs w:val="24"/>
+                <w:rtl/>
+              </w:rPr>
+              <w:t xml:space="preserve">مولانا صفی الرحمٰن مبارکپوری</w:t>
+            </w:r>
+          </w:p>
+        </w:tc>
+        <w:tc>
+          <w:tcPr>
+            <w:tcW w:type="dxa" w:w="2200"/>
+            <w:tcMar>
+              <w:top w:type="dxa" w:w="30"/>
+              <w:left w:type="dxa" w:w="100"/>
+              <w:bottom w:type="dxa" w:w="30"/>
+              <w:right w:type="dxa" w:w="100"/>
+            </w:tcMar>
+            <w:vAlign w:val="center"/>
+          </w:tcPr>
+          <w:p>
+            <w:pPr>
+              <w:bidi/>
+              <w:spacing w:after="0" w:before="0" w:line="240" w:lineRule="auto"/>
+              <w:jc w:val="center"/>
+            </w:pPr>
+            <w:r>
+              <w:rPr>
+                <w:rFonts w:ascii="Jameel Noori Nastaleeq" w:cs="Jameel Noori Nastaleeq" w:eastAsia="Jameel Noori Nastaleeq" w:hAnsi="Jameel Noori Nastaleeq"/>
+                <w:sz w:val="24"/>
+                <w:szCs w:val="24"/>
+                <w:rtl/>
+              </w:rPr>
+              <w:t xml:space="preserve">المکتبۃ السلفیہ، شیش محل روڈ، لاہور</w:t>
+            </w:r>
+          </w:p>
+        </w:tc>
+        <w:tc>
+          <w:tcPr>
+            <w:tcW w:type="dxa" w:w="2000"/>
+            <w:tcMar>
+              <w:top w:type="dxa" w:w="30"/>
+              <w:left w:type="dxa" w:w="100"/>
+              <w:bottom w:type="dxa" w:w="30"/>
+              <w:right w:type="dxa" w:w="100"/>
+            </w:tcMar>
+            <w:vAlign w:val="center"/>
+          </w:tcPr>
+          <w:p>
+            <w:pPr>
+              <w:bidi/>
+              <w:spacing w:after="0" w:before="0" w:line="240" w:lineRule="auto"/>
+              <w:jc w:val="center"/>
+            </w:pPr>
+            <w:r>
+              <w:rPr>
+                <w:rFonts w:ascii="Jameel Noori Nastaleeq" w:cs="Jameel Noori Nastaleeq" w:eastAsia="Jameel Noori Nastaleeq" w:hAnsi="Jameel Noori Nastaleeq"/>
+                <w:sz w:val="24"/>
+                <w:szCs w:val="24"/>
+                <w:rtl/>
+              </w:rPr>
+              <w:t xml:space="preserve">محرم الحرام 1421ھ/مئی 2000ء</w:t>
+            </w:r>
+          </w:p>
+        </w:tc>
+      </w:tr>
+      <w:tr>
+        <w:trPr>
+          <w:tblHeader w:val="false"/>
+        </w:trPr>
+        <w:tc>
+          <w:tcPr>
+            <w:tcW w:type="dxa" w:w="700"/>
+            <w:tcMar>
+              <w:top w:type="dxa" w:w="30"/>
+              <w:left w:type="dxa" w:w="100"/>
+              <w:bottom w:type="dxa" w:w="30"/>
+              <w:right w:type="dxa" w:w="100"/>
+            </w:tcMar>
+            <w:vAlign w:val="center"/>
+          </w:tcPr>
+          <w:p>
+            <w:pPr>
+              <w:bidi/>
+              <w:spacing w:after="0" w:before="0" w:line="240" w:lineRule="auto"/>
+              <w:jc w:val="center"/>
+            </w:pPr>
+            <w:r>
+              <w:rPr>
+                <w:rFonts w:ascii="Jameel Noori Nastaleeq" w:cs="Jameel Noori Nastaleeq" w:eastAsia="Jameel Noori Nastaleeq" w:hAnsi="Jameel Noori Nastaleeq"/>
+                <w:sz w:val="24"/>
+                <w:szCs w:val="24"/>
+                <w:rtl/>
+              </w:rPr>
+              <w:t xml:space="preserve">7</w:t>
             </w:r>
           </w:p>
         </w:tc>
@@ -37730,7 +37980,7 @@
                 <w:szCs w:val="24"/>
                 <w:rtl/>
               </w:rPr>
-              <w:t xml:space="preserve">7</w:t>
+              <w:t xml:space="preserve">8</w:t>
             </w:r>
           </w:p>
         </w:tc>
@@ -37875,7 +38125,7 @@
                 <w:szCs w:val="24"/>
                 <w:rtl/>
               </w:rPr>
-              <w:t xml:space="preserve">8</w:t>
+              <w:t xml:space="preserve">9</w:t>
             </w:r>
           </w:p>
         </w:tc>
@@ -41662,7 +41912,7 @@
           <w:szCs w:val="26"/>
           <w:rtl/>
         </w:rPr>
-        <w:t xml:space="preserve">المواہب اللدنیہ، ج1، ص296۔</w:t>
+        <w:t xml:space="preserve">امام احمد بن محمد قسطلانی، سیرتِ محمدیہ ترجمہ مواہبِ لدنیہ (اول)، ترتیب و تدوین: محمد عبدالستار طاہر مسعودی، شبیر برادرز، زبیدہ سنٹر، 40 اردو بازار، لاہور، اشاعتِ اول اگست 2002ء، ص299۔</w:t>
       </w:r>
     </w:p>
   </w:footnote>
@@ -41686,7 +41936,7 @@
           <w:szCs w:val="26"/>
           <w:rtl/>
         </w:rPr>
-        <w:t xml:space="preserve">المواہب اللدنیہ، ج1، ص294، بحوالہ صحیح مسلم، ج1، ص237۔</w:t>
+        <w:t xml:space="preserve">المواہب اللدنیہ، ج1، ص296۔</w:t>
       </w:r>
     </w:p>
   </w:footnote>
@@ -41710,11 +41960,35 @@
           <w:szCs w:val="26"/>
           <w:rtl/>
         </w:rPr>
-        <w:t xml:space="preserve">مدارج النبوۃ، ج2، ص194۔</w:t>
+        <w:t xml:space="preserve">المواہب اللدنیہ، ج1، ص294، بحوالہ صحیح مسلم، ج1، ص237۔</w:t>
       </w:r>
     </w:p>
   </w:footnote>
   <w:footnote w:id="152">
+    <w:p>
+      <w:pPr>
+        <w:bidi/>
+        <w:spacing w:after="0" w:line="240" w:lineRule="auto"/>
+        <w:jc w:val="both"/>
+      </w:pPr>
+      <w:r>
+        <w:rPr>
+          <w:rStyle w:val="FootnoteReference"/>
+        </w:rPr>
+        <w:footnoteRef/>
+      </w:r>
+      <w:r>
+        <w:rPr>
+          <w:rFonts w:ascii="Jameel Noori Nastaleeq" w:cs="Jameel Noori Nastaleeq" w:eastAsia="Jameel Noori Nastaleeq" w:hAnsi="Jameel Noori Nastaleeq"/>
+          <w:sz w:val="26"/>
+          <w:szCs w:val="26"/>
+          <w:rtl/>
+        </w:rPr>
+        <w:t xml:space="preserve">مدارج النبوۃ، ج2، ص194۔</w:t>
+      </w:r>
+    </w:p>
+  </w:footnote>
+  <w:footnote w:id="153">
     <w:p>
       <w:pPr>
         <w:bidi/>
@@ -41738,7 +42012,7 @@
       </w:r>
     </w:p>
   </w:footnote>
-  <w:footnote w:id="153">
+  <w:footnote w:id="154">
     <w:p>
       <w:pPr>
         <w:bidi/>
@@ -41758,11 +42032,11 @@
           <w:szCs w:val="26"/>
           <w:rtl/>
         </w:rPr>
-        <w:t xml:space="preserve">المواہب اللدنیہ، ج1، ص296۔</w:t>
+        <w:t xml:space="preserve">المواہب اللدنیہ، ج1، ص296؛ سیرتِ محمدیہ ترجمہ مواہبِ لدنیہ، ص300۔</w:t>
       </w:r>
     </w:p>
   </w:footnote>
-  <w:footnote w:id="154">
+  <w:footnote w:id="155">
     <w:p>
       <w:pPr>
         <w:bidi/>
@@ -41786,7 +42060,7 @@
       </w:r>
     </w:p>
   </w:footnote>
-  <w:footnote w:id="155">
+  <w:footnote w:id="156">
     <w:p>
       <w:pPr>
         <w:bidi/>
@@ -41810,7 +42084,7 @@
       </w:r>
     </w:p>
   </w:footnote>
-  <w:footnote w:id="156">
+  <w:footnote w:id="157">
     <w:p>
       <w:pPr>
         <w:bidi/>
@@ -41834,7 +42108,7 @@
       </w:r>
     </w:p>
   </w:footnote>
-  <w:footnote w:id="157">
+  <w:footnote w:id="158">
     <w:p>
       <w:pPr>
         <w:bidi/>
@@ -41858,7 +42132,7 @@
       </w:r>
     </w:p>
   </w:footnote>
-  <w:footnote w:id="158">
+  <w:footnote w:id="159">
     <w:p>
       <w:pPr>
         <w:bidi/>
@@ -41882,7 +42156,7 @@
       </w:r>
     </w:p>
   </w:footnote>
-  <w:footnote w:id="159">
+  <w:footnote w:id="160">
     <w:p>
       <w:pPr>
         <w:bidi/>
@@ -41906,7 +42180,7 @@
       </w:r>
     </w:p>
   </w:footnote>
-  <w:footnote w:id="160">
+  <w:footnote w:id="161">
     <w:p>
       <w:pPr>
         <w:bidi/>
@@ -41930,7 +42204,7 @@
       </w:r>
     </w:p>
   </w:footnote>
-  <w:footnote w:id="161">
+  <w:footnote w:id="162">
     <w:p>
       <w:pPr>
         <w:bidi/>
@@ -41954,7 +42228,7 @@
       </w:r>
     </w:p>
   </w:footnote>
-  <w:footnote w:id="162">
+  <w:footnote w:id="163">
     <w:p>
       <w:pPr>
         <w:bidi/>
@@ -41978,7 +42252,7 @@
       </w:r>
     </w:p>
   </w:footnote>
-  <w:footnote w:id="163">
+  <w:footnote w:id="164">
     <w:p>
       <w:pPr>
         <w:bidi/>
@@ -42002,7 +42276,7 @@
       </w:r>
     </w:p>
   </w:footnote>
-  <w:footnote w:id="164">
+  <w:footnote w:id="165">
     <w:p>
       <w:pPr>
         <w:bidi/>
@@ -42026,7 +42300,7 @@
       </w:r>
     </w:p>
   </w:footnote>
-  <w:footnote w:id="165">
+  <w:footnote w:id="166">
     <w:p>
       <w:pPr>
         <w:bidi/>
@@ -42050,7 +42324,7 @@
       </w:r>
     </w:p>
   </w:footnote>
-  <w:footnote w:id="166">
+  <w:footnote w:id="167">
     <w:p>
       <w:pPr>
         <w:bidi/>
@@ -42074,7 +42348,7 @@
       </w:r>
     </w:p>
   </w:footnote>
-  <w:footnote w:id="167">
+  <w:footnote w:id="168">
     <w:p>
       <w:pPr>
         <w:bidi/>
@@ -42098,7 +42372,7 @@
       </w:r>
     </w:p>
   </w:footnote>
-  <w:footnote w:id="168">
+  <w:footnote w:id="169">
     <w:p>
       <w:pPr>
         <w:bidi/>
@@ -42122,7 +42396,7 @@
       </w:r>
     </w:p>
   </w:footnote>
-  <w:footnote w:id="169">
+  <w:footnote w:id="170">
     <w:p>
       <w:pPr>
         <w:bidi/>
@@ -42146,7 +42420,7 @@
       </w:r>
     </w:p>
   </w:footnote>
-  <w:footnote w:id="170">
+  <w:footnote w:id="171">
     <w:p>
       <w:pPr>
         <w:bidi/>
@@ -42170,7 +42444,7 @@
       </w:r>
     </w:p>
   </w:footnote>
-  <w:footnote w:id="171">
+  <w:footnote w:id="172">
     <w:p>
       <w:pPr>
         <w:bidi/>
@@ -42194,7 +42468,7 @@
       </w:r>
     </w:p>
   </w:footnote>
-  <w:footnote w:id="172">
+  <w:footnote w:id="173">
     <w:p>
       <w:pPr>
         <w:bidi/>
@@ -42218,7 +42492,7 @@
       </w:r>
     </w:p>
   </w:footnote>
-  <w:footnote w:id="173">
+  <w:footnote w:id="174">
     <w:p>
       <w:pPr>
         <w:bidi/>
@@ -42242,7 +42516,7 @@
       </w:r>
     </w:p>
   </w:footnote>
-  <w:footnote w:id="174">
+  <w:footnote w:id="175">
     <w:p>
       <w:pPr>
         <w:bidi/>
@@ -42266,7 +42540,7 @@
       </w:r>
     </w:p>
   </w:footnote>
-  <w:footnote w:id="175">
+  <w:footnote w:id="176">
     <w:p>
       <w:pPr>
         <w:bidi/>
@@ -42290,7 +42564,7 @@
       </w:r>
     </w:p>
   </w:footnote>
-  <w:footnote w:id="176">
+  <w:footnote w:id="177">
     <w:p>
       <w:pPr>
         <w:bidi/>
@@ -42314,7 +42588,7 @@
       </w:r>
     </w:p>
   </w:footnote>
-  <w:footnote w:id="177">
+  <w:footnote w:id="178">
     <w:p>
       <w:pPr>
         <w:bidi/>
@@ -42338,7 +42612,7 @@
       </w:r>
     </w:p>
   </w:footnote>
-  <w:footnote w:id="178">
+  <w:footnote w:id="179">
     <w:p>
       <w:pPr>
         <w:bidi/>
@@ -42362,7 +42636,7 @@
       </w:r>
     </w:p>
   </w:footnote>
-  <w:footnote w:id="179">
+  <w:footnote w:id="180">
     <w:p>
       <w:pPr>
         <w:bidi/>
@@ -42386,7 +42660,7 @@
       </w:r>
     </w:p>
   </w:footnote>
-  <w:footnote w:id="180">
+  <w:footnote w:id="181">
     <w:p>
       <w:pPr>
         <w:bidi/>
@@ -42410,7 +42684,7 @@
       </w:r>
     </w:p>
   </w:footnote>
-  <w:footnote w:id="181">
+  <w:footnote w:id="182">
     <w:p>
       <w:pPr>
         <w:bidi/>
@@ -42434,7 +42708,7 @@
       </w:r>
     </w:p>
   </w:footnote>
-  <w:footnote w:id="182">
+  <w:footnote w:id="183">
     <w:p>
       <w:pPr>
         <w:bidi/>
@@ -42458,7 +42732,7 @@
       </w:r>
     </w:p>
   </w:footnote>
-  <w:footnote w:id="183">
+  <w:footnote w:id="184">
     <w:p>
       <w:pPr>
         <w:bidi/>
@@ -42482,7 +42756,7 @@
       </w:r>
     </w:p>
   </w:footnote>
-  <w:footnote w:id="184">
+  <w:footnote w:id="185">
     <w:p>
       <w:pPr>
         <w:bidi/>
@@ -42506,7 +42780,7 @@
       </w:r>
     </w:p>
   </w:footnote>
-  <w:footnote w:id="185">
+  <w:footnote w:id="186">
     <w:p>
       <w:pPr>
         <w:bidi/>
@@ -42530,7 +42804,7 @@
       </w:r>
     </w:p>
   </w:footnote>
-  <w:footnote w:id="186">
+  <w:footnote w:id="187">
     <w:p>
       <w:pPr>
         <w:bidi/>
@@ -42554,7 +42828,7 @@
       </w:r>
     </w:p>
   </w:footnote>
-  <w:footnote w:id="187">
+  <w:footnote w:id="188">
     <w:p>
       <w:pPr>
         <w:bidi/>
@@ -42578,7 +42852,7 @@
       </w:r>
     </w:p>
   </w:footnote>
-  <w:footnote w:id="188">
+  <w:footnote w:id="189">
     <w:p>
       <w:pPr>
         <w:bidi/>
@@ -42602,7 +42876,7 @@
       </w:r>
     </w:p>
   </w:footnote>
-  <w:footnote w:id="189">
+  <w:footnote w:id="190">
     <w:p>
       <w:pPr>
         <w:bidi/>
@@ -42626,7 +42900,7 @@
       </w:r>
     </w:p>
   </w:footnote>
-  <w:footnote w:id="190">
+  <w:footnote w:id="191">
     <w:p>
       <w:pPr>
         <w:bidi/>
@@ -42650,7 +42924,7 @@
       </w:r>
     </w:p>
   </w:footnote>
-  <w:footnote w:id="191">
+  <w:footnote w:id="192">
     <w:p>
       <w:pPr>
         <w:bidi/>
@@ -42674,7 +42948,7 @@
       </w:r>
     </w:p>
   </w:footnote>
-  <w:footnote w:id="192">
+  <w:footnote w:id="193">
     <w:p>
       <w:pPr>
         <w:bidi/>
@@ -42694,11 +42968,11 @@
           <w:szCs w:val="26"/>
           <w:rtl/>
         </w:rPr>
-        <w:t xml:space="preserve">مدارج النبوۃ، ج2، ص332 تا 333۔</w:t>
+        <w:t xml:space="preserve">سیرتِ محمدیہ ترجمہ مواہبِ لدنیہ، ص397۔</w:t>
       </w:r>
     </w:p>
   </w:footnote>
-  <w:footnote w:id="193">
+  <w:footnote w:id="194">
     <w:p>
       <w:pPr>
         <w:bidi/>
@@ -42718,11 +42992,11 @@
           <w:szCs w:val="26"/>
           <w:rtl/>
         </w:rPr>
-        <w:t xml:space="preserve">مدارج النبوۃ، ج2، ص332، 334۔</w:t>
+        <w:t xml:space="preserve">مدارج النبوۃ، ج2، ص332 تا 333۔</w:t>
       </w:r>
     </w:p>
   </w:footnote>
-  <w:footnote w:id="194">
+  <w:footnote w:id="195">
     <w:p>
       <w:pPr>
         <w:bidi/>
@@ -42742,11 +43016,11 @@
           <w:szCs w:val="26"/>
           <w:rtl/>
         </w:rPr>
-        <w:t xml:space="preserve">المواہب اللدنیہ، ج1، ص397۔</w:t>
+        <w:t xml:space="preserve">سیرتِ محمدیہ ترجمہ مواہبِ لدنیہ، ص397۔</w:t>
       </w:r>
     </w:p>
   </w:footnote>
-  <w:footnote w:id="195">
+  <w:footnote w:id="196">
     <w:p>
       <w:pPr>
         <w:bidi/>
@@ -42766,11 +43040,11 @@
           <w:szCs w:val="26"/>
           <w:rtl/>
         </w:rPr>
-        <w:t xml:space="preserve">مدارج النبوۃ، ج2، ص325۔</w:t>
+        <w:t xml:space="preserve">مدارج النبوۃ، ج2، ص333۔</w:t>
       </w:r>
     </w:p>
   </w:footnote>
-  <w:footnote w:id="196">
+  <w:footnote w:id="197">
     <w:p>
       <w:pPr>
         <w:bidi/>
@@ -42790,11 +43064,11 @@
           <w:szCs w:val="26"/>
           <w:rtl/>
         </w:rPr>
-        <w:t xml:space="preserve">المواہب اللدنیہ، ج1، ص406، بحوالہ طبقاتِ ابن سعد، ج2، ص132۔</w:t>
+        <w:t xml:space="preserve">سیرتِ محمدیہ ترجمہ مواہبِ لدنیہ، ص397۔</w:t>
       </w:r>
     </w:p>
   </w:footnote>
-  <w:footnote w:id="197">
+  <w:footnote w:id="198">
     <w:p>
       <w:pPr>
         <w:bidi/>
@@ -42814,11 +43088,11 @@
           <w:szCs w:val="26"/>
           <w:rtl/>
         </w:rPr>
-        <w:t xml:space="preserve">مدارج النبوۃ، ج2، ص336۔</w:t>
+        <w:t xml:space="preserve">ایضاً، ص396 تا 397؛ مدارج النبوۃ، ج2، ص332۔</w:t>
       </w:r>
     </w:p>
   </w:footnote>
-  <w:footnote w:id="198">
+  <w:footnote w:id="199">
     <w:p>
       <w:pPr>
         <w:bidi/>
@@ -42838,11 +43112,11 @@
           <w:szCs w:val="26"/>
           <w:rtl/>
         </w:rPr>
-        <w:t xml:space="preserve">المواہب اللدنیہ، ج1، ص406 تا 407۔</w:t>
+        <w:t xml:space="preserve">المواہب اللدنیہ، ج1، ص397۔</w:t>
       </w:r>
     </w:p>
   </w:footnote>
-  <w:footnote w:id="199">
+  <w:footnote w:id="200">
     <w:p>
       <w:pPr>
         <w:bidi/>
@@ -42862,11 +43136,11 @@
           <w:szCs w:val="26"/>
           <w:rtl/>
         </w:rPr>
-        <w:t xml:space="preserve">المواہب اللدنیہ، ج1، ص437 تا 438، بحوالہ طبقاتِ ابن سعد، ج2، ص145 تا 146؛ مدارج النبوۃ، ج2، ص364 تا 365۔</w:t>
+        <w:t xml:space="preserve">مدارج النبوۃ، ج2، ص325۔</w:t>
       </w:r>
     </w:p>
   </w:footnote>
-  <w:footnote w:id="200">
+  <w:footnote w:id="201">
     <w:p>
       <w:pPr>
         <w:bidi/>
@@ -42886,11 +43160,11 @@
           <w:szCs w:val="26"/>
           <w:rtl/>
         </w:rPr>
-        <w:t xml:space="preserve">المواہب اللدنیہ، ج1، ص438، بحوالہ طبقاتِ ابن سعد، ج2، ص147۔</w:t>
+        <w:t xml:space="preserve">المواہب اللدنیہ، ج1، ص406، بحوالہ طبقاتِ ابن سعد، ج2، ص132۔</w:t>
       </w:r>
     </w:p>
   </w:footnote>
-  <w:footnote w:id="201">
+  <w:footnote w:id="202">
     <w:p>
       <w:pPr>
         <w:bidi/>
@@ -42910,11 +43184,11 @@
           <w:szCs w:val="26"/>
           <w:rtl/>
         </w:rPr>
-        <w:t xml:space="preserve">مدارج النبوۃ، ج2، ص365۔</w:t>
+        <w:t xml:space="preserve">مدارج النبوۃ، ج2، ص336۔</w:t>
       </w:r>
     </w:p>
   </w:footnote>
-  <w:footnote w:id="202">
+  <w:footnote w:id="203">
     <w:p>
       <w:pPr>
         <w:bidi/>
@@ -42934,11 +43208,11 @@
           <w:szCs w:val="26"/>
           <w:rtl/>
         </w:rPr>
-        <w:t xml:space="preserve">المواہب اللدنیہ، ج1، ص448۔</w:t>
+        <w:t xml:space="preserve">المواہب اللدنیہ، ج1، ص406 تا 407۔</w:t>
       </w:r>
     </w:p>
   </w:footnote>
-  <w:footnote w:id="203">
+  <w:footnote w:id="204">
     <w:p>
       <w:pPr>
         <w:bidi/>
@@ -42958,11 +43232,11 @@
           <w:szCs w:val="26"/>
           <w:rtl/>
         </w:rPr>
-        <w:t xml:space="preserve">مدارج النبوۃ، ج2، ص373 تا 374۔</w:t>
+        <w:t xml:space="preserve">المواہب اللدنیہ، ج1، ص437 تا 438، بحوالہ طبقاتِ ابن سعد، ج2، ص145 تا 146؛ مدارج النبوۃ، ج2، ص364 تا 365۔</w:t>
       </w:r>
     </w:p>
   </w:footnote>
-  <w:footnote w:id="204">
+  <w:footnote w:id="205">
     <w:p>
       <w:pPr>
         <w:bidi/>
@@ -42982,11 +43256,11 @@
           <w:szCs w:val="26"/>
           <w:rtl/>
         </w:rPr>
-        <w:t xml:space="preserve">المواہب اللدنیہ، ج1، ص448، بحوالہ فتح الباری، ج8، ص34۔</w:t>
+        <w:t xml:space="preserve">المواہب اللدنیہ، ج1، ص438، بحوالہ طبقاتِ ابن سعد، ج2، ص147۔</w:t>
       </w:r>
     </w:p>
   </w:footnote>
-  <w:footnote w:id="205">
+  <w:footnote w:id="206">
     <w:p>
       <w:pPr>
         <w:bidi/>
@@ -43006,11 +43280,11 @@
           <w:szCs w:val="26"/>
           <w:rtl/>
         </w:rPr>
-        <w:t xml:space="preserve">مدارج النبوۃ، ج2، ص374۔</w:t>
+        <w:t xml:space="preserve">مدارج النبوۃ، ج2، ص365۔</w:t>
       </w:r>
     </w:p>
   </w:footnote>
-  <w:footnote w:id="206">
+  <w:footnote w:id="207">
     <w:p>
       <w:pPr>
         <w:bidi/>
@@ -43034,7 +43308,7 @@
       </w:r>
     </w:p>
   </w:footnote>
-  <w:footnote w:id="207">
+  <w:footnote w:id="208">
     <w:p>
       <w:pPr>
         <w:bidi/>
@@ -43054,11 +43328,11 @@
           <w:szCs w:val="26"/>
           <w:rtl/>
         </w:rPr>
-        <w:t xml:space="preserve">مدارج النبوۃ، ج2، ص374۔</w:t>
+        <w:t xml:space="preserve">مدارج النبوۃ، ج2، ص373 تا 374۔</w:t>
       </w:r>
     </w:p>
   </w:footnote>
-  <w:footnote w:id="208">
+  <w:footnote w:id="209">
     <w:p>
       <w:pPr>
         <w:bidi/>
@@ -43078,11 +43352,11 @@
           <w:szCs w:val="26"/>
           <w:rtl/>
         </w:rPr>
-        <w:t xml:space="preserve">المواہب اللدنیہ، ج1، ص449، بحوالہ صحیح بخاری، ج2، ص619؛ مدارج النبوۃ، ج2، ص374۔</w:t>
+        <w:t xml:space="preserve">المواہب اللدنیہ، ج1، ص448، بحوالہ فتح الباری، ج8، ص34۔</w:t>
       </w:r>
     </w:p>
   </w:footnote>
-  <w:footnote w:id="209">
+  <w:footnote w:id="210">
     <w:p>
       <w:pPr>
         <w:bidi/>
@@ -43102,11 +43376,11 @@
           <w:szCs w:val="26"/>
           <w:rtl/>
         </w:rPr>
-        <w:t xml:space="preserve">المواہب اللدنیہ، ج1، ص449، بحوالہ طبقاتِ ابن سعد، ج2، ص157۔</w:t>
+        <w:t xml:space="preserve">مدارج النبوۃ، ج2، ص374۔</w:t>
       </w:r>
     </w:p>
   </w:footnote>
-  <w:footnote w:id="210">
+  <w:footnote w:id="211">
     <w:p>
       <w:pPr>
         <w:bidi/>
@@ -43126,11 +43400,11 @@
           <w:szCs w:val="26"/>
           <w:rtl/>
         </w:rPr>
-        <w:t xml:space="preserve">مدارج النبوۃ، ج2، ص376۔</w:t>
+        <w:t xml:space="preserve">المواہب اللدنیہ، ج1، ص448۔</w:t>
       </w:r>
     </w:p>
   </w:footnote>
-  <w:footnote w:id="211">
+  <w:footnote w:id="212">
     <w:p>
       <w:pPr>
         <w:bidi/>
@@ -43150,11 +43424,11 @@
           <w:szCs w:val="26"/>
           <w:rtl/>
         </w:rPr>
-        <w:t xml:space="preserve">مدارج النبوۃ، ج2، ص391۔</w:t>
+        <w:t xml:space="preserve">مدارج النبوۃ، ج2، ص374۔</w:t>
       </w:r>
     </w:p>
   </w:footnote>
-  <w:footnote w:id="212">
+  <w:footnote w:id="213">
     <w:p>
       <w:pPr>
         <w:bidi/>
@@ -43174,11 +43448,11 @@
           <w:szCs w:val="26"/>
           <w:rtl/>
         </w:rPr>
-        <w:t xml:space="preserve">المواہب اللدنیہ، ج1، ص457 تا 458، بحوالہ طبقاتِ ابن سعد، ج2، ص160 تا 161۔</w:t>
+        <w:t xml:space="preserve">المواہب اللدنیہ، ج1، ص449، بحوالہ صحیح بخاری، ج2، ص619؛ مدارج النبوۃ، ج2، ص374۔</w:t>
       </w:r>
     </w:p>
   </w:footnote>
-  <w:footnote w:id="213">
+  <w:footnote w:id="214">
     <w:p>
       <w:pPr>
         <w:bidi/>
@@ -43198,11 +43472,11 @@
           <w:szCs w:val="26"/>
           <w:rtl/>
         </w:rPr>
-        <w:t xml:space="preserve">مدارج النبوۃ، ج2، ص391 تا 392۔</w:t>
+        <w:t xml:space="preserve">المواہب اللدنیہ، ج1، ص449، بحوالہ طبقاتِ ابن سعد، ج2، ص157۔</w:t>
       </w:r>
     </w:p>
   </w:footnote>
-  <w:footnote w:id="214">
+  <w:footnote w:id="215">
     <w:p>
       <w:pPr>
         <w:bidi/>
@@ -43222,11 +43496,11 @@
           <w:szCs w:val="26"/>
           <w:rtl/>
         </w:rPr>
-        <w:t xml:space="preserve">المواہب اللدنیہ، ج1، ص460، بحوالہ طبقاتِ ابن سعد، ج2، ص161؛ مدارج النبوۃ، ج2، ص396۔</w:t>
+        <w:t xml:space="preserve">مدارج النبوۃ، ج2، ص376۔</w:t>
       </w:r>
     </w:p>
   </w:footnote>
-  <w:footnote w:id="215">
+  <w:footnote w:id="216">
     <w:p>
       <w:pPr>
         <w:bidi/>
@@ -43246,11 +43520,11 @@
           <w:szCs w:val="26"/>
           <w:rtl/>
         </w:rPr>
-        <w:t xml:space="preserve">المواہب اللدنیہ، ج1، ص460۔</w:t>
+        <w:t xml:space="preserve">مدارج النبوۃ، ج2، ص391۔</w:t>
       </w:r>
     </w:p>
   </w:footnote>
-  <w:footnote w:id="216">
+  <w:footnote w:id="217">
     <w:p>
       <w:pPr>
         <w:bidi/>
@@ -43270,11 +43544,11 @@
           <w:szCs w:val="26"/>
           <w:rtl/>
         </w:rPr>
-        <w:t xml:space="preserve">مدارج النبوۃ، ج2، ص396۔</w:t>
+        <w:t xml:space="preserve">المواہب اللدنیہ، ج1، ص457 تا 458، بحوالہ طبقاتِ ابن سعد، ج2، ص160 تا 161۔</w:t>
       </w:r>
     </w:p>
   </w:footnote>
-  <w:footnote w:id="217">
+  <w:footnote w:id="218">
     <w:p>
       <w:pPr>
         <w:bidi/>
@@ -43294,11 +43568,11 @@
           <w:szCs w:val="26"/>
           <w:rtl/>
         </w:rPr>
-        <w:t xml:space="preserve">المواہب اللدنیہ، ج1، ص460، بحوالہ طبقاتِ ابن سعد، ج2، ص163۔</w:t>
+        <w:t xml:space="preserve">مدارج النبوۃ، ج2، ص391 تا 392۔</w:t>
       </w:r>
     </w:p>
   </w:footnote>
-  <w:footnote w:id="218">
+  <w:footnote w:id="219">
     <w:p>
       <w:pPr>
         <w:bidi/>
@@ -43318,11 +43592,11 @@
           <w:szCs w:val="26"/>
           <w:rtl/>
         </w:rPr>
-        <w:t xml:space="preserve">مدارج النبوۃ، ج2، ص396۔</w:t>
+        <w:t xml:space="preserve">المواہب اللدنیہ، ج1، ص460، بحوالہ طبقاتِ ابن سعد، ج2، ص161؛ مدارج النبوۃ، ج2، ص396۔</w:t>
       </w:r>
     </w:p>
   </w:footnote>
-  <w:footnote w:id="219">
+  <w:footnote w:id="220">
     <w:p>
       <w:pPr>
         <w:bidi/>
@@ -43342,11 +43616,11 @@
           <w:szCs w:val="26"/>
           <w:rtl/>
         </w:rPr>
-        <w:t xml:space="preserve">المواہب اللدنیہ، ج1، ص462، بحوالہ طبقاتِ ابن سعد، ج2، ص164؛ مدارج النبوۃ، ج2، ص397۔</w:t>
+        <w:t xml:space="preserve">المواہب اللدنیہ، ج1، ص460۔</w:t>
       </w:r>
     </w:p>
   </w:footnote>
-  <w:footnote w:id="220">
+  <w:footnote w:id="221">
     <w:p>
       <w:pPr>
         <w:bidi/>
@@ -43366,11 +43640,11 @@
           <w:szCs w:val="26"/>
           <w:rtl/>
         </w:rPr>
-        <w:t xml:space="preserve">مدارج النبوۃ، ج2، ص322۔</w:t>
+        <w:t xml:space="preserve">مدارج النبوۃ، ج2، ص396۔</w:t>
       </w:r>
     </w:p>
   </w:footnote>
-  <w:footnote w:id="221">
+  <w:footnote w:id="222">
     <w:p>
       <w:pPr>
         <w:bidi/>
@@ -43390,11 +43664,11 @@
           <w:szCs w:val="26"/>
           <w:rtl/>
         </w:rPr>
-        <w:t xml:space="preserve">المواہب اللدنیہ، ج1، ص487۔</w:t>
+        <w:t xml:space="preserve">المواہب اللدنیہ، ج1، ص460، بحوالہ طبقاتِ ابن سعد، ج2، ص163۔</w:t>
       </w:r>
     </w:p>
   </w:footnote>
-  <w:footnote w:id="222">
+  <w:footnote w:id="223">
     <w:p>
       <w:pPr>
         <w:bidi/>
@@ -43414,11 +43688,11 @@
           <w:szCs w:val="26"/>
           <w:rtl/>
         </w:rPr>
-        <w:t xml:space="preserve">المواہب اللدنیہ، ج1، ص488، بحوالہ طبقاتِ ابن سعد، ج2، ص191؛ مدارج النبوۃ، ج2، ص476۔</w:t>
+        <w:t xml:space="preserve">مدارج النبوۃ، ج2، ص396۔</w:t>
       </w:r>
     </w:p>
   </w:footnote>
-  <w:footnote w:id="223">
+  <w:footnote w:id="224">
     <w:p>
       <w:pPr>
         <w:bidi/>
@@ -43438,11 +43712,11 @@
           <w:szCs w:val="26"/>
           <w:rtl/>
         </w:rPr>
-        <w:t xml:space="preserve">المواہب اللدنیہ، ج1، ص489؛ مدارج النبوۃ، ج2، ص476۔</w:t>
+        <w:t xml:space="preserve">المواہب اللدنیہ، ج1، ص462، بحوالہ طبقاتِ ابن سعد، ج2، ص164؛ مدارج النبوۃ، ج2، ص397۔</w:t>
       </w:r>
     </w:p>
   </w:footnote>
-  <w:footnote w:id="224">
+  <w:footnote w:id="225">
     <w:p>
       <w:pPr>
         <w:bidi/>
@@ -43462,11 +43736,11 @@
           <w:szCs w:val="26"/>
           <w:rtl/>
         </w:rPr>
-        <w:t xml:space="preserve">مدارج النبوۃ، ج2، ص477۔</w:t>
+        <w:t xml:space="preserve">مدارج النبوۃ، ج2، ص322۔</w:t>
       </w:r>
     </w:p>
   </w:footnote>
-  <w:footnote w:id="225">
+  <w:footnote w:id="226">
     <w:p>
       <w:pPr>
         <w:bidi/>
@@ -43486,11 +43760,11 @@
           <w:szCs w:val="26"/>
           <w:rtl/>
         </w:rPr>
-        <w:t xml:space="preserve">المواہب اللدنیہ، ج1، ص490۔</w:t>
+        <w:t xml:space="preserve">المواہب اللدنیہ، ج1، ص487۔</w:t>
       </w:r>
     </w:p>
   </w:footnote>
-  <w:footnote w:id="226">
+  <w:footnote w:id="227">
     <w:p>
       <w:pPr>
         <w:bidi/>
@@ -43510,11 +43784,107 @@
           <w:szCs w:val="26"/>
           <w:rtl/>
         </w:rPr>
+        <w:t xml:space="preserve">المواہب اللدنیہ، ج1، ص488، بحوالہ طبقاتِ ابن سعد، ج2، ص191؛ مدارج النبوۃ، ج2، ص476۔</w:t>
+      </w:r>
+    </w:p>
+  </w:footnote>
+  <w:footnote w:id="228">
+    <w:p>
+      <w:pPr>
+        <w:bidi/>
+        <w:spacing w:after="0" w:line="240" w:lineRule="auto"/>
+        <w:jc w:val="both"/>
+      </w:pPr>
+      <w:r>
+        <w:rPr>
+          <w:rStyle w:val="FootnoteReference"/>
+        </w:rPr>
+        <w:footnoteRef/>
+      </w:r>
+      <w:r>
+        <w:rPr>
+          <w:rFonts w:ascii="Jameel Noori Nastaleeq" w:cs="Jameel Noori Nastaleeq" w:eastAsia="Jameel Noori Nastaleeq" w:hAnsi="Jameel Noori Nastaleeq"/>
+          <w:sz w:val="26"/>
+          <w:szCs w:val="26"/>
+          <w:rtl/>
+        </w:rPr>
+        <w:t xml:space="preserve">المواہب اللدنیہ، ج1، ص489؛ مدارج النبوۃ، ج2، ص476۔</w:t>
+      </w:r>
+    </w:p>
+  </w:footnote>
+  <w:footnote w:id="229">
+    <w:p>
+      <w:pPr>
+        <w:bidi/>
+        <w:spacing w:after="0" w:line="240" w:lineRule="auto"/>
+        <w:jc w:val="both"/>
+      </w:pPr>
+      <w:r>
+        <w:rPr>
+          <w:rStyle w:val="FootnoteReference"/>
+        </w:rPr>
+        <w:footnoteRef/>
+      </w:r>
+      <w:r>
+        <w:rPr>
+          <w:rFonts w:ascii="Jameel Noori Nastaleeq" w:cs="Jameel Noori Nastaleeq" w:eastAsia="Jameel Noori Nastaleeq" w:hAnsi="Jameel Noori Nastaleeq"/>
+          <w:sz w:val="26"/>
+          <w:szCs w:val="26"/>
+          <w:rtl/>
+        </w:rPr>
         <w:t xml:space="preserve">مدارج النبوۃ، ج2، ص477۔</w:t>
       </w:r>
     </w:p>
   </w:footnote>
-  <w:footnote w:id="227">
+  <w:footnote w:id="230">
+    <w:p>
+      <w:pPr>
+        <w:bidi/>
+        <w:spacing w:after="0" w:line="240" w:lineRule="auto"/>
+        <w:jc w:val="both"/>
+      </w:pPr>
+      <w:r>
+        <w:rPr>
+          <w:rStyle w:val="FootnoteReference"/>
+        </w:rPr>
+        <w:footnoteRef/>
+      </w:r>
+      <w:r>
+        <w:rPr>
+          <w:rFonts w:ascii="Jameel Noori Nastaleeq" w:cs="Jameel Noori Nastaleeq" w:eastAsia="Jameel Noori Nastaleeq" w:hAnsi="Jameel Noori Nastaleeq"/>
+          <w:sz w:val="26"/>
+          <w:szCs w:val="26"/>
+          <w:rtl/>
+        </w:rPr>
+        <w:t xml:space="preserve">المواہب اللدنیہ، ج1، ص490۔</w:t>
+      </w:r>
+    </w:p>
+  </w:footnote>
+  <w:footnote w:id="231">
+    <w:p>
+      <w:pPr>
+        <w:bidi/>
+        <w:spacing w:after="0" w:line="240" w:lineRule="auto"/>
+        <w:jc w:val="both"/>
+      </w:pPr>
+      <w:r>
+        <w:rPr>
+          <w:rStyle w:val="FootnoteReference"/>
+        </w:rPr>
+        <w:footnoteRef/>
+      </w:r>
+      <w:r>
+        <w:rPr>
+          <w:rFonts w:ascii="Jameel Noori Nastaleeq" w:cs="Jameel Noori Nastaleeq" w:eastAsia="Jameel Noori Nastaleeq" w:hAnsi="Jameel Noori Nastaleeq"/>
+          <w:sz w:val="26"/>
+          <w:szCs w:val="26"/>
+          <w:rtl/>
+        </w:rPr>
+        <w:t xml:space="preserve">مدارج النبوۃ، ج2، ص477۔</w:t>
+      </w:r>
+    </w:p>
+  </w:footnote>
+  <w:footnote w:id="232">
     <w:p>
       <w:pPr>
         <w:bidi/>
@@ -43538,7 +43908,7 @@
       </w:r>
     </w:p>
   </w:footnote>
-  <w:footnote w:id="228">
+  <w:footnote w:id="233">
     <w:p>
       <w:pPr>
         <w:bidi/>
@@ -43562,7 +43932,7 @@
       </w:r>
     </w:p>
   </w:footnote>
-  <w:footnote w:id="229">
+  <w:footnote w:id="234">
     <w:p>
       <w:pPr>
         <w:bidi/>
@@ -43586,7 +43956,7 @@
       </w:r>
     </w:p>
   </w:footnote>
-  <w:footnote w:id="230">
+  <w:footnote w:id="235">
     <w:p>
       <w:pPr>
         <w:bidi/>
@@ -43610,7 +43980,7 @@
       </w:r>
     </w:p>
   </w:footnote>
-  <w:footnote w:id="231">
+  <w:footnote w:id="236">
     <w:p>
       <w:pPr>
         <w:bidi/>
@@ -43634,7 +44004,7 @@
       </w:r>
     </w:p>
   </w:footnote>
-  <w:footnote w:id="232">
+  <w:footnote w:id="237">
     <w:p>
       <w:pPr>
         <w:bidi/>
@@ -43658,7 +44028,7 @@
       </w:r>
     </w:p>
   </w:footnote>
-  <w:footnote w:id="233">
+  <w:footnote w:id="238">
     <w:p>
       <w:pPr>
         <w:bidi/>
@@ -43682,7 +44052,7 @@
       </w:r>
     </w:p>
   </w:footnote>
-  <w:footnote w:id="234">
+  <w:footnote w:id="239">
     <w:p>
       <w:pPr>
         <w:bidi/>
@@ -43706,7 +44076,7 @@
       </w:r>
     </w:p>
   </w:footnote>
-  <w:footnote w:id="235">
+  <w:footnote w:id="240">
     <w:p>
       <w:pPr>
         <w:bidi/>
@@ -43730,7 +44100,7 @@
       </w:r>
     </w:p>
   </w:footnote>
-  <w:footnote w:id="236">
+  <w:footnote w:id="241">
     <w:p>
       <w:pPr>
         <w:bidi/>
@@ -43754,7 +44124,7 @@
       </w:r>
     </w:p>
   </w:footnote>
-  <w:footnote w:id="237">
+  <w:footnote w:id="242">
     <w:p>
       <w:pPr>
         <w:bidi/>
@@ -43778,7 +44148,7 @@
       </w:r>
     </w:p>
   </w:footnote>
-  <w:footnote w:id="238">
+  <w:footnote w:id="243">
     <w:p>
       <w:pPr>
         <w:bidi/>
@@ -43802,7 +44172,7 @@
       </w:r>
     </w:p>
   </w:footnote>
-  <w:footnote w:id="239">
+  <w:footnote w:id="244">
     <w:p>
       <w:pPr>
         <w:bidi/>
@@ -43822,11 +44192,11 @@
           <w:szCs w:val="26"/>
           <w:rtl/>
         </w:rPr>
-        <w:t xml:space="preserve">مدارج النبوۃ، ج2، ص333 تا 334۔</w:t>
+        <w:t xml:space="preserve">سیرتِ محمدیہ ترجمہ مواہبِ لدنیہ، ص397۔</w:t>
       </w:r>
     </w:p>
   </w:footnote>
-  <w:footnote w:id="240">
+  <w:footnote w:id="245">
     <w:p>
       <w:pPr>
         <w:bidi/>
@@ -43846,11 +44216,11 @@
           <w:szCs w:val="26"/>
           <w:rtl/>
         </w:rPr>
-        <w:t xml:space="preserve">المواہب اللدنیہ، ج1، ص397۔</w:t>
+        <w:t xml:space="preserve">مدارج النبوۃ، ج2، ص333 تا 334۔</w:t>
       </w:r>
     </w:p>
   </w:footnote>
-  <w:footnote w:id="241">
+  <w:footnote w:id="246">
     <w:p>
       <w:pPr>
         <w:bidi/>
@@ -43870,11 +44240,11 @@
           <w:szCs w:val="26"/>
           <w:rtl/>
         </w:rPr>
-        <w:t xml:space="preserve">مدارج النبوۃ، ج2، ص329۔</w:t>
+        <w:t xml:space="preserve">المواہب اللدنیہ، ج1، ص397۔</w:t>
       </w:r>
     </w:p>
   </w:footnote>
-  <w:footnote w:id="242">
+  <w:footnote w:id="247">
     <w:p>
       <w:pPr>
         <w:bidi/>
@@ -43894,11 +44264,11 @@
           <w:szCs w:val="26"/>
           <w:rtl/>
         </w:rPr>
-        <w:t xml:space="preserve">مدارج النبوۃ، ج2، ص116۔</w:t>
+        <w:t xml:space="preserve">مدارج النبوۃ، ج2، ص329۔</w:t>
       </w:r>
     </w:p>
   </w:footnote>
-  <w:footnote w:id="243">
+  <w:footnote w:id="248">
     <w:p>
       <w:pPr>
         <w:bidi/>
@@ -43918,11 +44288,11 @@
           <w:szCs w:val="26"/>
           <w:rtl/>
         </w:rPr>
-        <w:t xml:space="preserve">المواہب اللدنیہ، ج1، ص407۔</w:t>
+        <w:t xml:space="preserve">مدارج النبوۃ، ج2، ص116۔</w:t>
       </w:r>
     </w:p>
   </w:footnote>
-  <w:footnote w:id="244">
+  <w:footnote w:id="249">
     <w:p>
       <w:pPr>
         <w:bidi/>
@@ -43942,11 +44312,11 @@
           <w:szCs w:val="26"/>
           <w:rtl/>
         </w:rPr>
-        <w:t xml:space="preserve">المواہب اللدنیہ، ج1، ص218، 220؛ مدارج النبوۃ، ج2، ص114۔</w:t>
+        <w:t xml:space="preserve">المواہب اللدنیہ، ج1، ص407۔</w:t>
       </w:r>
     </w:p>
   </w:footnote>
-  <w:footnote w:id="245">
+  <w:footnote w:id="250">
     <w:p>
       <w:pPr>
         <w:bidi/>
@@ -43966,11 +44336,11 @@
           <w:szCs w:val="26"/>
           <w:rtl/>
         </w:rPr>
-        <w:t xml:space="preserve">مدارج النبوۃ، ج2، ص117۔</w:t>
+        <w:t xml:space="preserve">المواہب اللدنیہ، ج1، ص218، 220؛ مدارج النبوۃ، ج2، ص114۔</w:t>
       </w:r>
     </w:p>
   </w:footnote>
-  <w:footnote w:id="246">
+  <w:footnote w:id="251">
     <w:p>
       <w:pPr>
         <w:bidi/>
@@ -43990,11 +44360,11 @@
           <w:szCs w:val="26"/>
           <w:rtl/>
         </w:rPr>
-        <w:t xml:space="preserve">المواہب اللدنیہ، ج1، ص407۔</w:t>
+        <w:t xml:space="preserve">مدارج النبوۃ، ج2، ص117۔</w:t>
       </w:r>
     </w:p>
   </w:footnote>
-  <w:footnote w:id="247">
+  <w:footnote w:id="252">
     <w:p>
       <w:pPr>
         <w:bidi/>
@@ -44014,11 +44384,11 @@
           <w:szCs w:val="26"/>
           <w:rtl/>
         </w:rPr>
-        <w:t xml:space="preserve">المواہب اللدنیہ، ج1، ص342؛ مدارج النبوۃ، ج2، ص248۔</w:t>
+        <w:t xml:space="preserve">المواہب اللدنیہ، ج1، ص407۔</w:t>
       </w:r>
     </w:p>
   </w:footnote>
-  <w:footnote w:id="248">
+  <w:footnote w:id="253">
     <w:p>
       <w:pPr>
         <w:bidi/>
@@ -44038,11 +44408,11 @@
           <w:szCs w:val="26"/>
           <w:rtl/>
         </w:rPr>
-        <w:t xml:space="preserve">المواہب اللدنیہ، ج1، ص262 تا 263۔</w:t>
+        <w:t xml:space="preserve">المواہب اللدنیہ، ج1، ص342؛ مدارج النبوۃ، ج2، ص248۔</w:t>
       </w:r>
     </w:p>
   </w:footnote>
-  <w:footnote w:id="249">
+  <w:footnote w:id="254">
     <w:p>
       <w:pPr>
         <w:bidi/>
@@ -44062,11 +44432,35 @@
           <w:szCs w:val="26"/>
           <w:rtl/>
         </w:rPr>
+        <w:t xml:space="preserve">المواہب اللدنیہ، ج1، ص262 تا 263۔</w:t>
+      </w:r>
+    </w:p>
+  </w:footnote>
+  <w:footnote w:id="255">
+    <w:p>
+      <w:pPr>
+        <w:bidi/>
+        <w:spacing w:after="0" w:line="240" w:lineRule="auto"/>
+        <w:jc w:val="both"/>
+      </w:pPr>
+      <w:r>
+        <w:rPr>
+          <w:rStyle w:val="FootnoteReference"/>
+        </w:rPr>
+        <w:footnoteRef/>
+      </w:r>
+      <w:r>
+        <w:rPr>
+          <w:rFonts w:ascii="Jameel Noori Nastaleeq" w:cs="Jameel Noori Nastaleeq" w:eastAsia="Jameel Noori Nastaleeq" w:hAnsi="Jameel Noori Nastaleeq"/>
+          <w:sz w:val="26"/>
+          <w:szCs w:val="26"/>
+          <w:rtl/>
+        </w:rPr>
         <w:t xml:space="preserve">المواہب اللدنیہ، ج1، ص264؛ مدارج النبوۃ، ج2، ص150 تا 151۔</w:t>
       </w:r>
     </w:p>
   </w:footnote>
-  <w:footnote w:id="250">
+  <w:footnote w:id="256">
     <w:p>
       <w:pPr>
         <w:bidi/>
@@ -44090,7 +44484,7 @@
       </w:r>
     </w:p>
   </w:footnote>
-  <w:footnote w:id="251">
+  <w:footnote w:id="257">
     <w:p>
       <w:pPr>
         <w:bidi/>
@@ -44114,7 +44508,7 @@
       </w:r>
     </w:p>
   </w:footnote>
-  <w:footnote w:id="252">
+  <w:footnote w:id="258">
     <w:p>
       <w:pPr>
         <w:bidi/>
@@ -44134,11 +44528,11 @@
           <w:szCs w:val="26"/>
           <w:rtl/>
         </w:rPr>
-        <w:t xml:space="preserve">المواہب اللدنیہ، ج1، ص341، 389، 457؛ مدارج النبوۃ، ج2، ص248۔</w:t>
+        <w:t xml:space="preserve">المواہب اللدنیہ، ج1، ص341، 389، 457؛ مدارج النبوۃ، ج2، ص248؛ سیرتِ محمدیہ ترجمہ مواہبِ لدنیہ، ص397۔</w:t>
       </w:r>
     </w:p>
   </w:footnote>
-  <w:footnote w:id="253">
+  <w:footnote w:id="259">
     <w:p>
       <w:pPr>
         <w:bidi/>
@@ -44162,7 +44556,7 @@
       </w:r>
     </w:p>
   </w:footnote>
-  <w:footnote w:id="254">
+  <w:footnote w:id="260">
     <w:p>
       <w:pPr>
         <w:bidi/>
@@ -44186,7 +44580,7 @@
       </w:r>
     </w:p>
   </w:footnote>
-  <w:footnote w:id="255">
+  <w:footnote w:id="261">
     <w:p>
       <w:pPr>
         <w:bidi/>
@@ -44210,7 +44604,7 @@
       </w:r>
     </w:p>
   </w:footnote>
-  <w:footnote w:id="256">
+  <w:footnote w:id="262">
     <w:p>
       <w:pPr>
         <w:bidi/>
@@ -44234,7 +44628,7 @@
       </w:r>
     </w:p>
   </w:footnote>
-  <w:footnote w:id="257">
+  <w:footnote w:id="263">
     <w:p>
       <w:pPr>
         <w:bidi/>
@@ -44258,7 +44652,7 @@
       </w:r>
     </w:p>
   </w:footnote>
-  <w:footnote w:id="258">
+  <w:footnote w:id="264">
     <w:p>
       <w:pPr>
         <w:bidi/>
@@ -44282,7 +44676,7 @@
       </w:r>
     </w:p>
   </w:footnote>
-  <w:footnote w:id="259">
+  <w:footnote w:id="265">
     <w:p>
       <w:pPr>
         <w:bidi/>
@@ -44306,7 +44700,7 @@
       </w:r>
     </w:p>
   </w:footnote>
-  <w:footnote w:id="260">
+  <w:footnote w:id="266">
     <w:p>
       <w:pPr>
         <w:bidi/>
@@ -44330,7 +44724,7 @@
       </w:r>
     </w:p>
   </w:footnote>
-  <w:footnote w:id="261">
+  <w:footnote w:id="267">
     <w:p>
       <w:pPr>
         <w:bidi/>
@@ -44354,7 +44748,7 @@
       </w:r>
     </w:p>
   </w:footnote>
-  <w:footnote w:id="262">
+  <w:footnote w:id="268">
     <w:p>
       <w:pPr>
         <w:bidi/>
@@ -44378,7 +44772,7 @@
       </w:r>
     </w:p>
   </w:footnote>
-  <w:footnote w:id="263">
+  <w:footnote w:id="269">
     <w:p>
       <w:pPr>
         <w:bidi/>
@@ -44402,7 +44796,7 @@
       </w:r>
     </w:p>
   </w:footnote>
-  <w:footnote w:id="264">
+  <w:footnote w:id="270">
     <w:p>
       <w:pPr>
         <w:bidi/>
@@ -44426,7 +44820,7 @@
       </w:r>
     </w:p>
   </w:footnote>
-  <w:footnote w:id="265">
+  <w:footnote w:id="271">
     <w:p>
       <w:pPr>
         <w:bidi/>
@@ -44450,7 +44844,7 @@
       </w:r>
     </w:p>
   </w:footnote>
-  <w:footnote w:id="266">
+  <w:footnote w:id="272">
     <w:p>
       <w:pPr>
         <w:bidi/>
@@ -44474,7 +44868,7 @@
       </w:r>
     </w:p>
   </w:footnote>
-  <w:footnote w:id="267">
+  <w:footnote w:id="273">
     <w:p>
       <w:pPr>
         <w:bidi/>
@@ -44498,7 +44892,7 @@
       </w:r>
     </w:p>
   </w:footnote>
-  <w:footnote w:id="268">
+  <w:footnote w:id="274">
     <w:p>
       <w:pPr>
         <w:bidi/>
@@ -44522,7 +44916,7 @@
       </w:r>
     </w:p>
   </w:footnote>
-  <w:footnote w:id="269">
+  <w:footnote w:id="275">
     <w:p>
       <w:pPr>
         <w:bidi/>
@@ -44546,7 +44940,7 @@
       </w:r>
     </w:p>
   </w:footnote>
-  <w:footnote w:id="270">
+  <w:footnote w:id="276">
     <w:p>
       <w:pPr>
         <w:bidi/>
@@ -44570,7 +44964,7 @@
       </w:r>
     </w:p>
   </w:footnote>
-  <w:footnote w:id="271">
+  <w:footnote w:id="277">
     <w:p>
       <w:pPr>
         <w:bidi/>
@@ -44594,7 +44988,7 @@
       </w:r>
     </w:p>
   </w:footnote>
-  <w:footnote w:id="272">
+  <w:footnote w:id="278">
     <w:p>
       <w:pPr>
         <w:bidi/>
@@ -44618,7 +45012,7 @@
       </w:r>
     </w:p>
   </w:footnote>
-  <w:footnote w:id="273">
+  <w:footnote w:id="279">
     <w:p>
       <w:pPr>
         <w:bidi/>
@@ -44642,7 +45036,7 @@
       </w:r>
     </w:p>
   </w:footnote>
-  <w:footnote w:id="274">
+  <w:footnote w:id="280">
     <w:p>
       <w:pPr>
         <w:bidi/>
@@ -44666,7 +45060,7 @@
       </w:r>
     </w:p>
   </w:footnote>
-  <w:footnote w:id="275">
+  <w:footnote w:id="281">
     <w:p>
       <w:pPr>
         <w:bidi/>
@@ -44690,7 +45084,7 @@
       </w:r>
     </w:p>
   </w:footnote>
-  <w:footnote w:id="276">
+  <w:footnote w:id="282">
     <w:p>
       <w:pPr>
         <w:bidi/>
@@ -44714,7 +45108,7 @@
       </w:r>
     </w:p>
   </w:footnote>
-  <w:footnote w:id="277">
+  <w:footnote w:id="283">
     <w:p>
       <w:pPr>
         <w:bidi/>
@@ -44738,7 +45132,7 @@
       </w:r>
     </w:p>
   </w:footnote>
-  <w:footnote w:id="278">
+  <w:footnote w:id="284">
     <w:p>
       <w:pPr>
         <w:bidi/>
@@ -44762,7 +45156,7 @@
       </w:r>
     </w:p>
   </w:footnote>
-  <w:footnote w:id="279">
+  <w:footnote w:id="285">
     <w:p>
       <w:pPr>
         <w:bidi/>
@@ -44786,7 +45180,7 @@
       </w:r>
     </w:p>
   </w:footnote>
-  <w:footnote w:id="280">
+  <w:footnote w:id="286">
     <w:p>
       <w:pPr>
         <w:bidi/>
@@ -44810,7 +45204,7 @@
       </w:r>
     </w:p>
   </w:footnote>
-  <w:footnote w:id="281">
+  <w:footnote w:id="287">
     <w:p>
       <w:pPr>
         <w:bidi/>
@@ -44834,7 +45228,7 @@
       </w:r>
     </w:p>
   </w:footnote>
-  <w:footnote w:id="282">
+  <w:footnote w:id="288">
     <w:p>
       <w:pPr>
         <w:bidi/>
@@ -44858,7 +45252,7 @@
       </w:r>
     </w:p>
   </w:footnote>
-  <w:footnote w:id="283">
+  <w:footnote w:id="289">
     <w:p>
       <w:pPr>
         <w:bidi/>
@@ -44882,7 +45276,7 @@
       </w:r>
     </w:p>
   </w:footnote>
-  <w:footnote w:id="284">
+  <w:footnote w:id="290">
     <w:p>
       <w:pPr>
         <w:bidi/>
@@ -44906,7 +45300,7 @@
       </w:r>
     </w:p>
   </w:footnote>
-  <w:footnote w:id="285">
+  <w:footnote w:id="291">
     <w:p>
       <w:pPr>
         <w:bidi/>
@@ -44930,7 +45324,7 @@
       </w:r>
     </w:p>
   </w:footnote>
-  <w:footnote w:id="286">
+  <w:footnote w:id="292">
     <w:p>
       <w:pPr>
         <w:bidi/>
@@ -44954,7 +45348,7 @@
       </w:r>
     </w:p>
   </w:footnote>
-  <w:footnote w:id="287">
+  <w:footnote w:id="293">
     <w:p>
       <w:pPr>
         <w:bidi/>
@@ -44978,7 +45372,7 @@
       </w:r>
     </w:p>
   </w:footnote>
-  <w:footnote w:id="288">
+  <w:footnote w:id="294">
     <w:p>
       <w:pPr>
         <w:bidi/>
@@ -45002,7 +45396,7 @@
       </w:r>
     </w:p>
   </w:footnote>
-  <w:footnote w:id="289">
+  <w:footnote w:id="295">
     <w:p>
       <w:pPr>
         <w:bidi/>
@@ -45026,7 +45420,7 @@
       </w:r>
     </w:p>
   </w:footnote>
-  <w:footnote w:id="290">
+  <w:footnote w:id="296">
     <w:p>
       <w:pPr>
         <w:bidi/>
@@ -45050,7 +45444,7 @@
       </w:r>
     </w:p>
   </w:footnote>
-  <w:footnote w:id="291">
+  <w:footnote w:id="297">
     <w:p>
       <w:pPr>
         <w:bidi/>
@@ -45074,7 +45468,7 @@
       </w:r>
     </w:p>
   </w:footnote>
-  <w:footnote w:id="292">
+  <w:footnote w:id="298">
     <w:p>
       <w:pPr>
         <w:bidi/>
@@ -45098,7 +45492,7 @@
       </w:r>
     </w:p>
   </w:footnote>
-  <w:footnote w:id="293">
+  <w:footnote w:id="299">
     <w:p>
       <w:pPr>
         <w:bidi/>
@@ -45122,7 +45516,7 @@
       </w:r>
     </w:p>
   </w:footnote>
-  <w:footnote w:id="294">
+  <w:footnote w:id="300">
     <w:p>
       <w:pPr>
         <w:bidi/>
@@ -45146,7 +45540,7 @@
       </w:r>
     </w:p>
   </w:footnote>
-  <w:footnote w:id="295">
+  <w:footnote w:id="301">
     <w:p>
       <w:pPr>
         <w:bidi/>
@@ -45170,7 +45564,7 @@
       </w:r>
     </w:p>
   </w:footnote>
-  <w:footnote w:id="296">
+  <w:footnote w:id="302">
     <w:p>
       <w:pPr>
         <w:bidi/>
@@ -45194,7 +45588,7 @@
       </w:r>
     </w:p>
   </w:footnote>
-  <w:footnote w:id="297">
+  <w:footnote w:id="303">
     <w:p>
       <w:pPr>
         <w:bidi/>
@@ -45218,7 +45612,7 @@
       </w:r>
     </w:p>
   </w:footnote>
-  <w:footnote w:id="298">
+  <w:footnote w:id="304">
     <w:p>
       <w:pPr>
         <w:bidi/>
@@ -45242,7 +45636,7 @@
       </w:r>
     </w:p>
   </w:footnote>
-  <w:footnote w:id="299">
+  <w:footnote w:id="305">
     <w:p>
       <w:pPr>
         <w:bidi/>
@@ -45266,7 +45660,7 @@
       </w:r>
     </w:p>
   </w:footnote>
-  <w:footnote w:id="300">
+  <w:footnote w:id="306">
     <w:p>
       <w:pPr>
         <w:bidi/>
@@ -45290,7 +45684,7 @@
       </w:r>
     </w:p>
   </w:footnote>
-  <w:footnote w:id="301">
+  <w:footnote w:id="307">
     <w:p>
       <w:pPr>
         <w:bidi/>

</xml_diff>

<commit_message>
Sahaba thesis: right-align headings and table text in Word, Urdu TOC styles
Co-Authored-By: Claude Opus 5.5 <noreply@anthropic.com>
Claude-Session: https://claude.ai/code/session_01UVcrkFAwrbrBas8hPMwJZW
</commit_message>
<xml_diff>
--- a/Sahaba/maqala/maqala-sahaba-mukammal.docx
+++ b/Sahaba/maqala/maqala-sahaba-mukammal.docx
@@ -134,7 +134,7 @@
             <w:pPr>
               <w:bidi/>
               <w:spacing w:after="0" w:before="0" w:line="240" w:lineRule="auto"/>
-              <w:jc w:val="right"/>
+              <w:jc w:val="both"/>
             </w:pPr>
             <w:r>
               <w:rPr>
@@ -164,7 +164,7 @@
             <w:pPr>
               <w:bidi/>
               <w:spacing w:after="0" w:before="0" w:line="240" w:lineRule="auto"/>
-              <w:jc w:val="right"/>
+              <w:jc w:val="both"/>
             </w:pPr>
             <w:r>
               <w:rPr>
@@ -197,7 +197,7 @@
             <w:pPr>
               <w:bidi/>
               <w:spacing w:after="0" w:before="0" w:line="240" w:lineRule="auto"/>
-              <w:jc w:val="right"/>
+              <w:jc w:val="both"/>
             </w:pPr>
             <w:r>
               <w:rPr>
@@ -227,7 +227,7 @@
             <w:pPr>
               <w:bidi/>
               <w:spacing w:after="0" w:before="0" w:line="240" w:lineRule="auto"/>
-              <w:jc w:val="right"/>
+              <w:jc w:val="both"/>
             </w:pPr>
             <w:r>
               <w:rPr>
@@ -260,7 +260,7 @@
             <w:pPr>
               <w:bidi/>
               <w:spacing w:after="0" w:before="0" w:line="240" w:lineRule="auto"/>
-              <w:jc w:val="right"/>
+              <w:jc w:val="both"/>
             </w:pPr>
             <w:r>
               <w:rPr>
@@ -290,7 +290,7 @@
             <w:pPr>
               <w:bidi/>
               <w:spacing w:after="0" w:before="0" w:line="240" w:lineRule="auto"/>
-              <w:jc w:val="right"/>
+              <w:jc w:val="both"/>
             </w:pPr>
           </w:p>
         </w:tc>
@@ -314,7 +314,7 @@
             <w:pPr>
               <w:bidi/>
               <w:spacing w:after="0" w:before="0" w:line="240" w:lineRule="auto"/>
-              <w:jc w:val="right"/>
+              <w:jc w:val="both"/>
             </w:pPr>
             <w:r>
               <w:rPr>
@@ -344,7 +344,7 @@
             <w:pPr>
               <w:bidi/>
               <w:spacing w:after="0" w:before="0" w:line="240" w:lineRule="auto"/>
-              <w:jc w:val="right"/>
+              <w:jc w:val="both"/>
             </w:pPr>
             <w:r>
               <w:rPr>
@@ -377,7 +377,7 @@
             <w:pPr>
               <w:bidi/>
               <w:spacing w:after="0" w:before="0" w:line="240" w:lineRule="auto"/>
-              <w:jc w:val="right"/>
+              <w:jc w:val="both"/>
             </w:pPr>
             <w:r>
               <w:rPr>
@@ -407,7 +407,7 @@
             <w:pPr>
               <w:bidi/>
               <w:spacing w:after="0" w:before="0" w:line="240" w:lineRule="auto"/>
-              <w:jc w:val="right"/>
+              <w:jc w:val="both"/>
             </w:pPr>
             <w:r>
               <w:rPr>
@@ -440,7 +440,7 @@
             <w:pPr>
               <w:bidi/>
               <w:spacing w:after="0" w:before="0" w:line="240" w:lineRule="auto"/>
-              <w:jc w:val="right"/>
+              <w:jc w:val="both"/>
             </w:pPr>
             <w:r>
               <w:rPr>
@@ -470,7 +470,7 @@
             <w:pPr>
               <w:bidi/>
               <w:spacing w:after="0" w:before="0" w:line="240" w:lineRule="auto"/>
-              <w:jc w:val="right"/>
+              <w:jc w:val="both"/>
             </w:pPr>
             <w:r>
               <w:rPr>
@@ -503,7 +503,7 @@
             <w:pPr>
               <w:bidi/>
               <w:spacing w:after="0" w:before="0" w:line="240" w:lineRule="auto"/>
-              <w:jc w:val="right"/>
+              <w:jc w:val="both"/>
             </w:pPr>
             <w:r>
               <w:rPr>
@@ -533,7 +533,7 @@
             <w:pPr>
               <w:bidi/>
               <w:spacing w:after="0" w:before="0" w:line="240" w:lineRule="auto"/>
-              <w:jc w:val="right"/>
+              <w:jc w:val="both"/>
             </w:pPr>
             <w:r>
               <w:rPr>
@@ -563,7 +563,7 @@
             <w:pPr>
               <w:bidi/>
               <w:spacing w:after="0" w:before="0" w:line="240" w:lineRule="auto"/>
-              <w:jc w:val="right"/>
+              <w:jc w:val="both"/>
             </w:pPr>
             <w:r>
               <w:rPr>
@@ -1968,7 +1968,7 @@
       <w:pPr>
         <w:bidi/>
         <w:spacing w:after="60" w:before="0" w:line="240" w:lineRule="auto"/>
-        <w:jc w:val="left"/>
+        <w:jc w:val="both"/>
       </w:pPr>
       <w:r>
         <w:rPr>
@@ -1984,7 +1984,7 @@
       <w:pPr>
         <w:bidi/>
         <w:spacing w:after="60" w:before="0" w:line="240" w:lineRule="auto"/>
-        <w:jc w:val="left"/>
+        <w:jc w:val="both"/>
       </w:pPr>
       <w:r>
         <w:rPr>
@@ -2000,7 +2000,7 @@
       <w:pPr>
         <w:bidi/>
         <w:spacing w:after="60" w:before="0" w:line="240" w:lineRule="auto"/>
-        <w:jc w:val="left"/>
+        <w:jc w:val="both"/>
       </w:pPr>
       <w:r>
         <w:rPr>
@@ -2016,7 +2016,7 @@
       <w:pPr>
         <w:bidi/>
         <w:spacing w:after="60" w:before="0" w:line="240" w:lineRule="auto"/>
-        <w:jc w:val="left"/>
+        <w:jc w:val="both"/>
       </w:pPr>
       <w:r>
         <w:rPr>
@@ -2087,7 +2087,7 @@
       <w:pPr>
         <w:bidi/>
         <w:spacing w:after="60" w:before="0" w:line="240" w:lineRule="auto"/>
-        <w:jc w:val="left"/>
+        <w:jc w:val="both"/>
       </w:pPr>
       <w:r>
         <w:rPr>
@@ -2103,7 +2103,7 @@
       <w:pPr>
         <w:bidi/>
         <w:spacing w:after="60" w:before="0" w:line="240" w:lineRule="auto"/>
-        <w:jc w:val="left"/>
+        <w:jc w:val="both"/>
       </w:pPr>
       <w:r>
         <w:rPr>
@@ -2119,7 +2119,7 @@
       <w:pPr>
         <w:bidi/>
         <w:spacing w:after="60" w:before="0" w:line="240" w:lineRule="auto"/>
-        <w:jc w:val="left"/>
+        <w:jc w:val="both"/>
       </w:pPr>
       <w:r>
         <w:rPr>
@@ -2135,7 +2135,7 @@
       <w:pPr>
         <w:bidi/>
         <w:spacing w:after="60" w:before="0" w:line="240" w:lineRule="auto"/>
-        <w:jc w:val="left"/>
+        <w:jc w:val="both"/>
       </w:pPr>
       <w:r>
         <w:rPr>
@@ -2361,7 +2361,7 @@
         <w:keepNext/>
         <w:bidi/>
         <w:spacing w:after="80" w:before="160" w:line="240" w:lineRule="auto"/>
-        <w:jc w:val="right"/>
+        <w:jc w:val="both"/>
       </w:pPr>
       <w:r>
         <w:rPr>
@@ -2453,7 +2453,7 @@
         <w:keepNext/>
         <w:bidi/>
         <w:spacing w:after="80" w:before="160" w:line="240" w:lineRule="auto"/>
-        <w:jc w:val="right"/>
+        <w:jc w:val="both"/>
       </w:pPr>
       <w:r>
         <w:rPr>
@@ -2590,7 +2590,7 @@
         <w:keepNext/>
         <w:bidi/>
         <w:spacing w:after="80" w:before="160" w:line="240" w:lineRule="auto"/>
-        <w:jc w:val="right"/>
+        <w:jc w:val="both"/>
       </w:pPr>
       <w:r>
         <w:rPr>
@@ -2626,7 +2626,7 @@
         <w:keepNext/>
         <w:bidi/>
         <w:spacing w:after="60" w:before="100" w:line="240" w:lineRule="auto"/>
-        <w:jc w:val="right"/>
+        <w:jc w:val="both"/>
       </w:pPr>
       <w:r>
         <w:rPr>
@@ -2677,7 +2677,7 @@
         <w:keepNext/>
         <w:bidi/>
         <w:spacing w:after="60" w:before="100" w:line="240" w:lineRule="auto"/>
-        <w:jc w:val="right"/>
+        <w:jc w:val="both"/>
       </w:pPr>
       <w:r>
         <w:rPr>
@@ -2728,7 +2728,7 @@
         <w:keepNext/>
         <w:bidi/>
         <w:spacing w:after="60" w:before="100" w:line="240" w:lineRule="auto"/>
-        <w:jc w:val="right"/>
+        <w:jc w:val="both"/>
       </w:pPr>
       <w:r>
         <w:rPr>
@@ -2779,7 +2779,7 @@
         <w:keepNext/>
         <w:bidi/>
         <w:spacing w:after="60" w:before="100" w:line="240" w:lineRule="auto"/>
-        <w:jc w:val="right"/>
+        <w:jc w:val="both"/>
       </w:pPr>
       <w:r>
         <w:rPr>
@@ -2821,7 +2821,7 @@
         <w:keepNext/>
         <w:bidi/>
         <w:spacing w:after="60" w:before="100" w:line="240" w:lineRule="auto"/>
-        <w:jc w:val="right"/>
+        <w:jc w:val="both"/>
       </w:pPr>
       <w:r>
         <w:rPr>
@@ -2858,7 +2858,7 @@
         <w:keepNext/>
         <w:bidi/>
         <w:spacing w:after="80" w:before="160" w:line="240" w:lineRule="auto"/>
-        <w:jc w:val="right"/>
+        <w:jc w:val="both"/>
       </w:pPr>
       <w:r>
         <w:rPr>
@@ -2877,7 +2877,7 @@
         <w:keepNext/>
         <w:bidi/>
         <w:spacing w:after="60" w:before="100" w:line="240" w:lineRule="auto"/>
-        <w:jc w:val="right"/>
+        <w:jc w:val="both"/>
       </w:pPr>
       <w:r>
         <w:rPr>
@@ -2981,7 +2981,7 @@
         <w:keepNext/>
         <w:bidi/>
         <w:spacing w:after="60" w:before="100" w:line="240" w:lineRule="auto"/>
-        <w:jc w:val="right"/>
+        <w:jc w:val="both"/>
       </w:pPr>
       <w:r>
         <w:rPr>
@@ -3069,7 +3069,7 @@
         <w:keepNext/>
         <w:bidi/>
         <w:spacing w:after="80" w:before="160" w:line="240" w:lineRule="auto"/>
-        <w:jc w:val="right"/>
+        <w:jc w:val="both"/>
       </w:pPr>
       <w:r>
         <w:rPr>
@@ -3174,7 +3174,7 @@
         <w:keepNext/>
         <w:bidi/>
         <w:spacing w:after="80" w:before="160" w:line="240" w:lineRule="auto"/>
-        <w:jc w:val="right"/>
+        <w:jc w:val="both"/>
       </w:pPr>
       <w:r>
         <w:rPr>
@@ -3193,7 +3193,7 @@
         <w:keepNext/>
         <w:bidi/>
         <w:spacing w:after="60" w:before="100" w:line="240" w:lineRule="auto"/>
-        <w:jc w:val="right"/>
+        <w:jc w:val="both"/>
       </w:pPr>
       <w:r>
         <w:rPr>
@@ -3229,7 +3229,7 @@
         <w:keepNext/>
         <w:bidi/>
         <w:spacing w:after="60" w:before="100" w:line="240" w:lineRule="auto"/>
-        <w:jc w:val="right"/>
+        <w:jc w:val="both"/>
       </w:pPr>
       <w:r>
         <w:rPr>
@@ -3350,7 +3350,7 @@
         <w:keepNext/>
         <w:bidi/>
         <w:spacing w:after="60" w:before="100" w:line="240" w:lineRule="auto"/>
-        <w:jc w:val="right"/>
+        <w:jc w:val="both"/>
       </w:pPr>
       <w:r>
         <w:rPr>
@@ -3472,7 +3472,7 @@
         <w:keepNext/>
         <w:bidi/>
         <w:spacing w:after="80" w:before="160" w:line="240" w:lineRule="auto"/>
-        <w:jc w:val="right"/>
+        <w:jc w:val="both"/>
       </w:pPr>
       <w:r>
         <w:rPr>
@@ -4613,7 +4613,7 @@
         <w:keepNext/>
         <w:bidi/>
         <w:spacing w:after="80" w:before="160" w:line="240" w:lineRule="auto"/>
-        <w:jc w:val="right"/>
+        <w:jc w:val="both"/>
       </w:pPr>
       <w:r>
         <w:rPr>
@@ -4820,7 +4820,7 @@
         <w:keepNext/>
         <w:bidi/>
         <w:spacing w:after="80" w:before="160" w:line="240" w:lineRule="auto"/>
-        <w:jc w:val="right"/>
+        <w:jc w:val="both"/>
       </w:pPr>
       <w:r>
         <w:rPr>
@@ -4929,7 +4929,7 @@
         <w:keepNext/>
         <w:bidi/>
         <w:spacing w:after="80" w:before="160" w:line="240" w:lineRule="auto"/>
-        <w:jc w:val="right"/>
+        <w:jc w:val="both"/>
       </w:pPr>
       <w:r>
         <w:rPr>
@@ -5036,7 +5036,7 @@
         <w:keepNext/>
         <w:bidi/>
         <w:spacing w:after="80" w:before="160" w:line="240" w:lineRule="auto"/>
-        <w:jc w:val="right"/>
+        <w:jc w:val="both"/>
       </w:pPr>
       <w:r>
         <w:rPr>
@@ -5650,7 +5650,7 @@
         <w:keepNext/>
         <w:bidi/>
         <w:spacing w:after="80" w:before="160" w:line="240" w:lineRule="auto"/>
-        <w:jc w:val="right"/>
+        <w:jc w:val="both"/>
       </w:pPr>
       <w:r>
         <w:rPr>
@@ -6291,7 +6291,7 @@
         <w:keepNext/>
         <w:bidi/>
         <w:spacing w:after="80" w:before="160" w:line="240" w:lineRule="auto"/>
-        <w:jc w:val="right"/>
+        <w:jc w:val="both"/>
       </w:pPr>
       <w:r>
         <w:rPr>
@@ -6463,7 +6463,7 @@
         <w:keepNext/>
         <w:bidi/>
         <w:spacing w:after="80" w:before="160" w:line="240" w:lineRule="auto"/>
-        <w:jc w:val="right"/>
+        <w:jc w:val="both"/>
       </w:pPr>
       <w:r>
         <w:rPr>
@@ -6543,7 +6543,7 @@
         <w:keepNext/>
         <w:bidi/>
         <w:spacing w:after="80" w:before="160" w:line="240" w:lineRule="auto"/>
-        <w:jc w:val="right"/>
+        <w:jc w:val="both"/>
       </w:pPr>
       <w:r>
         <w:rPr>
@@ -6618,7 +6618,7 @@
         <w:keepNext/>
         <w:bidi/>
         <w:spacing w:after="80" w:before="160" w:line="240" w:lineRule="auto"/>
-        <w:jc w:val="right"/>
+        <w:jc w:val="both"/>
       </w:pPr>
       <w:r>
         <w:rPr>
@@ -6784,7 +6784,7 @@
         <w:keepNext/>
         <w:bidi/>
         <w:spacing w:after="80" w:before="160" w:line="240" w:lineRule="auto"/>
-        <w:jc w:val="right"/>
+        <w:jc w:val="both"/>
       </w:pPr>
       <w:r>
         <w:rPr>
@@ -6918,7 +6918,7 @@
         <w:keepNext/>
         <w:bidi/>
         <w:spacing w:after="80" w:before="160" w:line="240" w:lineRule="auto"/>
-        <w:jc w:val="right"/>
+        <w:jc w:val="both"/>
       </w:pPr>
       <w:r>
         <w:rPr>
@@ -6978,7 +6978,7 @@
         <w:keepNext/>
         <w:bidi/>
         <w:spacing w:after="80" w:before="160" w:line="240" w:lineRule="auto"/>
-        <w:jc w:val="right"/>
+        <w:jc w:val="both"/>
       </w:pPr>
       <w:r>
         <w:rPr>
@@ -7290,7 +7290,7 @@
         <w:keepNext/>
         <w:bidi/>
         <w:spacing w:after="80" w:before="160" w:line="240" w:lineRule="auto"/>
-        <w:jc w:val="right"/>
+        <w:jc w:val="both"/>
       </w:pPr>
       <w:r>
         <w:rPr>
@@ -7776,7 +7776,7 @@
         <w:keepNext/>
         <w:bidi/>
         <w:spacing w:after="80" w:before="160" w:line="240" w:lineRule="auto"/>
-        <w:jc w:val="right"/>
+        <w:jc w:val="both"/>
       </w:pPr>
       <w:r>
         <w:rPr>
@@ -7891,7 +7891,7 @@
         <w:keepNext/>
         <w:bidi/>
         <w:spacing w:after="80" w:before="160" w:line="240" w:lineRule="auto"/>
-        <w:jc w:val="right"/>
+        <w:jc w:val="both"/>
       </w:pPr>
       <w:r>
         <w:rPr>
@@ -8113,7 +8113,7 @@
         <w:keepNext/>
         <w:bidi/>
         <w:spacing w:after="80" w:before="160" w:line="240" w:lineRule="auto"/>
-        <w:jc w:val="right"/>
+        <w:jc w:val="both"/>
       </w:pPr>
       <w:r>
         <w:rPr>
@@ -8211,7 +8211,7 @@
         <w:keepNext/>
         <w:bidi/>
         <w:spacing w:after="80" w:before="160" w:line="240" w:lineRule="auto"/>
-        <w:jc w:val="right"/>
+        <w:jc w:val="both"/>
       </w:pPr>
       <w:r>
         <w:rPr>
@@ -8286,7 +8286,7 @@
         <w:keepNext/>
         <w:bidi/>
         <w:spacing w:after="80" w:before="160" w:line="240" w:lineRule="auto"/>
-        <w:jc w:val="right"/>
+        <w:jc w:val="both"/>
       </w:pPr>
       <w:r>
         <w:rPr>
@@ -8568,7 +8568,7 @@
         <w:keepNext/>
         <w:bidi/>
         <w:spacing w:after="80" w:before="160" w:line="240" w:lineRule="auto"/>
-        <w:jc w:val="right"/>
+        <w:jc w:val="both"/>
       </w:pPr>
       <w:r>
         <w:rPr>
@@ -8696,7 +8696,7 @@
         <w:keepNext/>
         <w:bidi/>
         <w:spacing w:after="80" w:before="160" w:line="240" w:lineRule="auto"/>
-        <w:jc w:val="right"/>
+        <w:jc w:val="both"/>
       </w:pPr>
       <w:r>
         <w:rPr>
@@ -8732,7 +8732,7 @@
         <w:keepNext/>
         <w:bidi/>
         <w:spacing w:after="60" w:before="100" w:line="240" w:lineRule="auto"/>
-        <w:jc w:val="right"/>
+        <w:jc w:val="both"/>
       </w:pPr>
       <w:r>
         <w:rPr>
@@ -8789,7 +8789,7 @@
         <w:keepNext/>
         <w:bidi/>
         <w:spacing w:after="60" w:before="100" w:line="240" w:lineRule="auto"/>
-        <w:jc w:val="right"/>
+        <w:jc w:val="both"/>
       </w:pPr>
       <w:r>
         <w:rPr>
@@ -8846,7 +8846,7 @@
         <w:keepNext/>
         <w:bidi/>
         <w:spacing w:after="60" w:before="100" w:line="240" w:lineRule="auto"/>
-        <w:jc w:val="right"/>
+        <w:jc w:val="both"/>
       </w:pPr>
       <w:r>
         <w:rPr>
@@ -8978,7 +8978,7 @@
         <w:keepNext/>
         <w:bidi/>
         <w:spacing w:after="80" w:before="160" w:line="240" w:lineRule="auto"/>
-        <w:jc w:val="right"/>
+        <w:jc w:val="both"/>
       </w:pPr>
       <w:r>
         <w:rPr>
@@ -10151,7 +10151,7 @@
         <w:keepNext/>
         <w:bidi/>
         <w:spacing w:after="80" w:before="160" w:line="240" w:lineRule="auto"/>
-        <w:jc w:val="right"/>
+        <w:jc w:val="both"/>
       </w:pPr>
       <w:r>
         <w:rPr>
@@ -10231,7 +10231,7 @@
         <w:keepNext/>
         <w:bidi/>
         <w:spacing w:after="60" w:before="100" w:line="240" w:lineRule="auto"/>
-        <w:jc w:val="right"/>
+        <w:jc w:val="both"/>
       </w:pPr>
       <w:r>
         <w:rPr>
@@ -10454,7 +10454,7 @@
         <w:keepNext/>
         <w:bidi/>
         <w:spacing w:after="80" w:before="160" w:line="240" w:lineRule="auto"/>
-        <w:jc w:val="right"/>
+        <w:jc w:val="both"/>
       </w:pPr>
       <w:r>
         <w:rPr>
@@ -10544,7 +10544,7 @@
         <w:keepNext/>
         <w:bidi/>
         <w:spacing w:after="80" w:before="160" w:line="240" w:lineRule="auto"/>
-        <w:jc w:val="right"/>
+        <w:jc w:val="both"/>
       </w:pPr>
       <w:r>
         <w:rPr>
@@ -10683,7 +10683,7 @@
         <w:keepNext/>
         <w:bidi/>
         <w:spacing w:after="80" w:before="160" w:line="240" w:lineRule="auto"/>
-        <w:jc w:val="right"/>
+        <w:jc w:val="both"/>
       </w:pPr>
       <w:r>
         <w:rPr>
@@ -10769,7 +10769,7 @@
         <w:keepNext/>
         <w:bidi/>
         <w:spacing w:after="80" w:before="160" w:line="240" w:lineRule="auto"/>
-        <w:jc w:val="right"/>
+        <w:jc w:val="both"/>
       </w:pPr>
       <w:r>
         <w:rPr>
@@ -10855,7 +10855,7 @@
         <w:keepNext/>
         <w:bidi/>
         <w:spacing w:after="80" w:before="160" w:line="240" w:lineRule="auto"/>
-        <w:jc w:val="right"/>
+        <w:jc w:val="both"/>
       </w:pPr>
       <w:r>
         <w:rPr>
@@ -11139,7 +11139,7 @@
         <w:keepNext/>
         <w:bidi/>
         <w:spacing w:after="80" w:before="160" w:line="240" w:lineRule="auto"/>
-        <w:jc w:val="right"/>
+        <w:jc w:val="both"/>
       </w:pPr>
       <w:r>
         <w:rPr>
@@ -11196,7 +11196,7 @@
         <w:keepNext/>
         <w:bidi/>
         <w:spacing w:after="60" w:before="100" w:line="240" w:lineRule="auto"/>
-        <w:jc w:val="right"/>
+        <w:jc w:val="both"/>
       </w:pPr>
       <w:r>
         <w:rPr>
@@ -11275,7 +11275,7 @@
         <w:keepNext/>
         <w:bidi/>
         <w:spacing w:after="60" w:before="100" w:line="240" w:lineRule="auto"/>
-        <w:jc w:val="right"/>
+        <w:jc w:val="both"/>
       </w:pPr>
       <w:r>
         <w:rPr>
@@ -11562,7 +11562,7 @@
         <w:keepNext/>
         <w:bidi/>
         <w:spacing w:after="60" w:before="100" w:line="240" w:lineRule="auto"/>
-        <w:jc w:val="right"/>
+        <w:jc w:val="both"/>
       </w:pPr>
       <w:r>
         <w:rPr>
@@ -11650,7 +11650,7 @@
         <w:keepNext/>
         <w:bidi/>
         <w:spacing w:after="80" w:before="160" w:line="240" w:lineRule="auto"/>
-        <w:jc w:val="right"/>
+        <w:jc w:val="both"/>
       </w:pPr>
       <w:r>
         <w:rPr>
@@ -13311,7 +13311,7 @@
         <w:keepNext/>
         <w:bidi/>
         <w:spacing w:after="80" w:before="160" w:line="240" w:lineRule="auto"/>
-        <w:jc w:val="right"/>
+        <w:jc w:val="both"/>
       </w:pPr>
       <w:r>
         <w:rPr>
@@ -13496,7 +13496,7 @@
         <w:keepNext/>
         <w:bidi/>
         <w:spacing w:after="80" w:before="160" w:line="240" w:lineRule="auto"/>
-        <w:jc w:val="right"/>
+        <w:jc w:val="both"/>
       </w:pPr>
       <w:r>
         <w:rPr>
@@ -13563,7 +13563,7 @@
         <w:keepNext/>
         <w:bidi/>
         <w:spacing w:after="80" w:before="160" w:line="240" w:lineRule="auto"/>
-        <w:jc w:val="right"/>
+        <w:jc w:val="both"/>
       </w:pPr>
       <w:r>
         <w:rPr>
@@ -13800,7 +13800,7 @@
         <w:keepNext/>
         <w:bidi/>
         <w:spacing w:after="80" w:before="160" w:line="240" w:lineRule="auto"/>
-        <w:jc w:val="right"/>
+        <w:jc w:val="both"/>
       </w:pPr>
       <w:r>
         <w:rPr>
@@ -13948,7 +13948,7 @@
         <w:keepNext/>
         <w:bidi/>
         <w:spacing w:after="80" w:before="160" w:line="240" w:lineRule="auto"/>
-        <w:jc w:val="right"/>
+        <w:jc w:val="both"/>
       </w:pPr>
       <w:r>
         <w:rPr>
@@ -14000,7 +14000,7 @@
         <w:keepNext/>
         <w:bidi/>
         <w:spacing w:after="80" w:before="160" w:line="240" w:lineRule="auto"/>
-        <w:jc w:val="right"/>
+        <w:jc w:val="both"/>
       </w:pPr>
       <w:r>
         <w:rPr>
@@ -14086,7 +14086,7 @@
         <w:keepNext/>
         <w:bidi/>
         <w:spacing w:after="80" w:before="160" w:line="240" w:lineRule="auto"/>
-        <w:jc w:val="right"/>
+        <w:jc w:val="both"/>
       </w:pPr>
       <w:r>
         <w:rPr>
@@ -14149,7 +14149,7 @@
         <w:keepNext/>
         <w:bidi/>
         <w:spacing w:after="80" w:before="160" w:line="240" w:lineRule="auto"/>
-        <w:jc w:val="right"/>
+        <w:jc w:val="both"/>
       </w:pPr>
       <w:r>
         <w:rPr>
@@ -14327,7 +14327,7 @@
         <w:keepNext/>
         <w:bidi/>
         <w:spacing w:after="80" w:before="160" w:line="240" w:lineRule="auto"/>
-        <w:jc w:val="right"/>
+        <w:jc w:val="both"/>
       </w:pPr>
       <w:r>
         <w:rPr>
@@ -14573,7 +14573,7 @@
         <w:keepNext/>
         <w:bidi/>
         <w:spacing w:after="80" w:before="160" w:line="240" w:lineRule="auto"/>
-        <w:jc w:val="right"/>
+        <w:jc w:val="both"/>
       </w:pPr>
       <w:r>
         <w:rPr>
@@ -14609,7 +14609,7 @@
         <w:keepNext/>
         <w:bidi/>
         <w:spacing w:after="60" w:before="100" w:line="240" w:lineRule="auto"/>
-        <w:jc w:val="right"/>
+        <w:jc w:val="both"/>
       </w:pPr>
       <w:r>
         <w:rPr>
@@ -14699,7 +14699,7 @@
         <w:keepNext/>
         <w:bidi/>
         <w:spacing w:after="60" w:before="100" w:line="240" w:lineRule="auto"/>
-        <w:jc w:val="right"/>
+        <w:jc w:val="both"/>
       </w:pPr>
       <w:r>
         <w:rPr>
@@ -14784,7 +14784,7 @@
         <w:keepNext/>
         <w:bidi/>
         <w:spacing w:after="60" w:before="100" w:line="240" w:lineRule="auto"/>
-        <w:jc w:val="right"/>
+        <w:jc w:val="both"/>
       </w:pPr>
       <w:r>
         <w:rPr>
@@ -14856,7 +14856,7 @@
         <w:keepNext/>
         <w:bidi/>
         <w:spacing w:after="60" w:before="100" w:line="240" w:lineRule="auto"/>
-        <w:jc w:val="right"/>
+        <w:jc w:val="both"/>
       </w:pPr>
       <w:r>
         <w:rPr>
@@ -14937,7 +14937,7 @@
         <w:keepNext/>
         <w:bidi/>
         <w:spacing w:after="60" w:before="100" w:line="240" w:lineRule="auto"/>
-        <w:jc w:val="right"/>
+        <w:jc w:val="both"/>
       </w:pPr>
       <w:r>
         <w:rPr>
@@ -15022,7 +15022,7 @@
         <w:keepNext/>
         <w:bidi/>
         <w:spacing w:after="60" w:before="100" w:line="240" w:lineRule="auto"/>
-        <w:jc w:val="right"/>
+        <w:jc w:val="both"/>
       </w:pPr>
       <w:r>
         <w:rPr>
@@ -15080,7 +15080,7 @@
         <w:keepNext/>
         <w:bidi/>
         <w:spacing w:after="80" w:before="160" w:line="240" w:lineRule="auto"/>
-        <w:jc w:val="right"/>
+        <w:jc w:val="both"/>
       </w:pPr>
       <w:r>
         <w:rPr>
@@ -15132,7 +15132,7 @@
         <w:keepNext/>
         <w:bidi/>
         <w:spacing w:after="80" w:before="160" w:line="240" w:lineRule="auto"/>
-        <w:jc w:val="right"/>
+        <w:jc w:val="both"/>
       </w:pPr>
       <w:r>
         <w:rPr>
@@ -17531,7 +17531,7 @@
         <w:keepNext/>
         <w:bidi/>
         <w:spacing w:after="80" w:before="160" w:line="240" w:lineRule="auto"/>
-        <w:jc w:val="right"/>
+        <w:jc w:val="both"/>
       </w:pPr>
       <w:r>
         <w:rPr>
@@ -17788,7 +17788,7 @@
         <w:keepNext/>
         <w:bidi/>
         <w:spacing w:after="80" w:before="160" w:line="240" w:lineRule="auto"/>
-        <w:jc w:val="right"/>
+        <w:jc w:val="both"/>
       </w:pPr>
       <w:r>
         <w:rPr>
@@ -17845,7 +17845,7 @@
         <w:keepNext/>
         <w:bidi/>
         <w:spacing w:after="60" w:before="100" w:line="240" w:lineRule="auto"/>
-        <w:jc w:val="right"/>
+        <w:jc w:val="both"/>
       </w:pPr>
       <w:r>
         <w:rPr>
@@ -17911,7 +17911,7 @@
         <w:keepNext/>
         <w:bidi/>
         <w:spacing w:after="60" w:before="100" w:line="240" w:lineRule="auto"/>
-        <w:jc w:val="right"/>
+        <w:jc w:val="both"/>
       </w:pPr>
       <w:r>
         <w:rPr>
@@ -18013,7 +18013,7 @@
         <w:keepNext/>
         <w:bidi/>
         <w:spacing w:after="60" w:before="100" w:line="240" w:lineRule="auto"/>
-        <w:jc w:val="right"/>
+        <w:jc w:val="both"/>
       </w:pPr>
       <w:r>
         <w:rPr>
@@ -18070,7 +18070,7 @@
         <w:keepNext/>
         <w:bidi/>
         <w:spacing w:after="60" w:before="100" w:line="240" w:lineRule="auto"/>
-        <w:jc w:val="right"/>
+        <w:jc w:val="both"/>
       </w:pPr>
       <w:r>
         <w:rPr>
@@ -18142,7 +18142,7 @@
         <w:keepNext/>
         <w:bidi/>
         <w:spacing w:after="60" w:before="100" w:line="240" w:lineRule="auto"/>
-        <w:jc w:val="right"/>
+        <w:jc w:val="both"/>
       </w:pPr>
       <w:r>
         <w:rPr>
@@ -18240,7 +18240,7 @@
         <w:keepNext/>
         <w:bidi/>
         <w:spacing w:after="60" w:before="100" w:line="240" w:lineRule="auto"/>
-        <w:jc w:val="right"/>
+        <w:jc w:val="both"/>
       </w:pPr>
       <w:r>
         <w:rPr>
@@ -18315,7 +18315,7 @@
         <w:keepNext/>
         <w:bidi/>
         <w:spacing w:after="80" w:before="160" w:line="240" w:lineRule="auto"/>
-        <w:jc w:val="right"/>
+        <w:jc w:val="both"/>
       </w:pPr>
       <w:r>
         <w:rPr>
@@ -18477,7 +18477,7 @@
         <w:keepNext/>
         <w:bidi/>
         <w:spacing w:after="80" w:before="160" w:line="240" w:lineRule="auto"/>
-        <w:jc w:val="right"/>
+        <w:jc w:val="both"/>
       </w:pPr>
       <w:r>
         <w:rPr>
@@ -18775,7 +18775,7 @@
         <w:keepNext/>
         <w:bidi/>
         <w:spacing w:after="80" w:before="160" w:line="240" w:lineRule="auto"/>
-        <w:jc w:val="right"/>
+        <w:jc w:val="both"/>
       </w:pPr>
       <w:r>
         <w:rPr>
@@ -18832,7 +18832,7 @@
         <w:keepNext/>
         <w:bidi/>
         <w:spacing w:after="60" w:before="100" w:line="240" w:lineRule="auto"/>
-        <w:jc w:val="right"/>
+        <w:jc w:val="both"/>
       </w:pPr>
       <w:r>
         <w:rPr>
@@ -18983,7 +18983,7 @@
         <w:keepNext/>
         <w:bidi/>
         <w:spacing w:after="60" w:before="100" w:line="240" w:lineRule="auto"/>
-        <w:jc w:val="right"/>
+        <w:jc w:val="both"/>
       </w:pPr>
       <w:r>
         <w:rPr>
@@ -19041,7 +19041,7 @@
         <w:keepNext/>
         <w:bidi/>
         <w:spacing w:after="80" w:before="160" w:line="240" w:lineRule="auto"/>
-        <w:jc w:val="right"/>
+        <w:jc w:val="both"/>
       </w:pPr>
       <w:r>
         <w:rPr>
@@ -19353,7 +19353,7 @@
         <w:keepNext/>
         <w:bidi/>
         <w:spacing w:after="80" w:before="160" w:line="240" w:lineRule="auto"/>
-        <w:jc w:val="right"/>
+        <w:jc w:val="both"/>
       </w:pPr>
       <w:r>
         <w:rPr>
@@ -19524,7 +19524,7 @@
         <w:keepNext/>
         <w:bidi/>
         <w:spacing w:after="80" w:before="160" w:line="240" w:lineRule="auto"/>
-        <w:jc w:val="right"/>
+        <w:jc w:val="both"/>
       </w:pPr>
       <w:r>
         <w:rPr>
@@ -23417,7 +23417,7 @@
         <w:keepNext/>
         <w:bidi/>
         <w:spacing w:after="80" w:before="160" w:line="240" w:lineRule="auto"/>
-        <w:jc w:val="right"/>
+        <w:jc w:val="both"/>
       </w:pPr>
       <w:r>
         <w:rPr>
@@ -24593,7 +24593,7 @@
         <w:keepNext/>
         <w:bidi/>
         <w:spacing w:after="80" w:before="160" w:line="240" w:lineRule="auto"/>
-        <w:jc w:val="right"/>
+        <w:jc w:val="both"/>
       </w:pPr>
       <w:r>
         <w:rPr>
@@ -24629,7 +24629,7 @@
         <w:keepNext/>
         <w:bidi/>
         <w:spacing w:after="60" w:before="100" w:line="240" w:lineRule="auto"/>
-        <w:jc w:val="right"/>
+        <w:jc w:val="both"/>
       </w:pPr>
       <w:r>
         <w:rPr>
@@ -24870,7 +24870,7 @@
         <w:keepNext/>
         <w:bidi/>
         <w:spacing w:after="60" w:before="100" w:line="240" w:lineRule="auto"/>
-        <w:jc w:val="right"/>
+        <w:jc w:val="both"/>
       </w:pPr>
       <w:r>
         <w:rPr>
@@ -25444,7 +25444,7 @@
         <w:keepNext/>
         <w:bidi/>
         <w:spacing w:after="80" w:before="160" w:line="240" w:lineRule="auto"/>
-        <w:jc w:val="right"/>
+        <w:jc w:val="both"/>
       </w:pPr>
       <w:r>
         <w:rPr>
@@ -25680,7 +25680,7 @@
         <w:keepNext/>
         <w:bidi/>
         <w:spacing w:after="80" w:before="160" w:line="240" w:lineRule="auto"/>
-        <w:jc w:val="right"/>
+        <w:jc w:val="both"/>
       </w:pPr>
       <w:r>
         <w:rPr>
@@ -25755,7 +25755,7 @@
         <w:keepNext/>
         <w:bidi/>
         <w:spacing w:after="80" w:before="160" w:line="240" w:lineRule="auto"/>
-        <w:jc w:val="right"/>
+        <w:jc w:val="both"/>
       </w:pPr>
       <w:r>
         <w:rPr>
@@ -25828,7 +25828,7 @@
         <w:keepNext/>
         <w:bidi/>
         <w:spacing w:after="80" w:before="160" w:line="240" w:lineRule="auto"/>
-        <w:jc w:val="right"/>
+        <w:jc w:val="both"/>
       </w:pPr>
       <w:r>
         <w:rPr>
@@ -25955,7 +25955,7 @@
         <w:keepNext/>
         <w:bidi/>
         <w:spacing w:after="80" w:before="160" w:line="240" w:lineRule="auto"/>
-        <w:jc w:val="right"/>
+        <w:jc w:val="both"/>
       </w:pPr>
       <w:r>
         <w:rPr>
@@ -26087,7 +26087,7 @@
         <w:keepNext/>
         <w:bidi/>
         <w:spacing w:after="80" w:before="160" w:line="240" w:lineRule="auto"/>
-        <w:jc w:val="right"/>
+        <w:jc w:val="both"/>
       </w:pPr>
       <w:r>
         <w:rPr>
@@ -26310,7 +26310,7 @@
         <w:keepNext/>
         <w:bidi/>
         <w:spacing w:after="80" w:before="160" w:line="240" w:lineRule="auto"/>
-        <w:jc w:val="right"/>
+        <w:jc w:val="both"/>
       </w:pPr>
       <w:r>
         <w:rPr>
@@ -26377,7 +26377,7 @@
         <w:keepNext/>
         <w:bidi/>
         <w:spacing w:after="80" w:before="160" w:line="240" w:lineRule="auto"/>
-        <w:jc w:val="right"/>
+        <w:jc w:val="both"/>
       </w:pPr>
       <w:r>
         <w:rPr>
@@ -26569,7 +26569,7 @@
         <w:keepNext/>
         <w:bidi/>
         <w:spacing w:after="80" w:before="160" w:line="240" w:lineRule="auto"/>
-        <w:jc w:val="right"/>
+        <w:jc w:val="both"/>
       </w:pPr>
       <w:r>
         <w:rPr>
@@ -26651,7 +26651,7 @@
         <w:keepNext/>
         <w:bidi/>
         <w:spacing w:after="80" w:before="160" w:line="240" w:lineRule="auto"/>
-        <w:jc w:val="right"/>
+        <w:jc w:val="both"/>
       </w:pPr>
       <w:r>
         <w:rPr>
@@ -26789,7 +26789,7 @@
         <w:keepNext/>
         <w:bidi/>
         <w:spacing w:after="80" w:before="160" w:line="240" w:lineRule="auto"/>
-        <w:jc w:val="right"/>
+        <w:jc w:val="both"/>
       </w:pPr>
       <w:r>
         <w:rPr>
@@ -26825,7 +26825,7 @@
         <w:keepNext/>
         <w:bidi/>
         <w:spacing w:after="60" w:before="100" w:line="240" w:lineRule="auto"/>
-        <w:jc w:val="right"/>
+        <w:jc w:val="both"/>
       </w:pPr>
       <w:r>
         <w:rPr>
@@ -26867,7 +26867,7 @@
         <w:keepNext/>
         <w:bidi/>
         <w:spacing w:after="60" w:before="100" w:line="240" w:lineRule="auto"/>
-        <w:jc w:val="right"/>
+        <w:jc w:val="both"/>
       </w:pPr>
       <w:r>
         <w:rPr>
@@ -26903,7 +26903,7 @@
         <w:keepNext/>
         <w:bidi/>
         <w:spacing w:after="60" w:before="100" w:line="240" w:lineRule="auto"/>
-        <w:jc w:val="right"/>
+        <w:jc w:val="both"/>
       </w:pPr>
       <w:r>
         <w:rPr>
@@ -26939,7 +26939,7 @@
         <w:keepNext/>
         <w:bidi/>
         <w:spacing w:after="60" w:before="100" w:line="240" w:lineRule="auto"/>
-        <w:jc w:val="right"/>
+        <w:jc w:val="both"/>
       </w:pPr>
       <w:r>
         <w:rPr>
@@ -27878,7 +27878,7 @@
         <w:keepNext/>
         <w:bidi/>
         <w:spacing w:after="80" w:before="160" w:line="240" w:lineRule="auto"/>
-        <w:jc w:val="right"/>
+        <w:jc w:val="both"/>
       </w:pPr>
       <w:r>
         <w:rPr>
@@ -27970,7 +27970,7 @@
         <w:keepNext/>
         <w:bidi/>
         <w:spacing w:after="80" w:before="160" w:line="240" w:lineRule="auto"/>
-        <w:jc w:val="right"/>
+        <w:jc w:val="both"/>
       </w:pPr>
       <w:r>
         <w:rPr>
@@ -28075,7 +28075,7 @@
         <w:keepNext/>
         <w:bidi/>
         <w:spacing w:after="80" w:before="160" w:line="240" w:lineRule="auto"/>
-        <w:jc w:val="right"/>
+        <w:jc w:val="both"/>
       </w:pPr>
       <w:r>
         <w:rPr>
@@ -28155,7 +28155,7 @@
         <w:keepNext/>
         <w:bidi/>
         <w:spacing w:after="80" w:before="160" w:line="240" w:lineRule="auto"/>
-        <w:jc w:val="right"/>
+        <w:jc w:val="both"/>
       </w:pPr>
       <w:r>
         <w:rPr>
@@ -28267,7 +28267,7 @@
         <w:keepNext/>
         <w:bidi/>
         <w:spacing w:after="80" w:before="160" w:line="240" w:lineRule="auto"/>
-        <w:jc w:val="right"/>
+        <w:jc w:val="both"/>
       </w:pPr>
       <w:r>
         <w:rPr>
@@ -29338,7 +29338,7 @@
         <w:keepNext/>
         <w:bidi/>
         <w:spacing w:after="80" w:before="160" w:line="240" w:lineRule="auto"/>
-        <w:jc w:val="right"/>
+        <w:jc w:val="both"/>
       </w:pPr>
       <w:r>
         <w:rPr>
@@ -29374,7 +29374,7 @@
         <w:keepNext/>
         <w:bidi/>
         <w:spacing w:after="60" w:before="100" w:line="240" w:lineRule="auto"/>
-        <w:jc w:val="right"/>
+        <w:jc w:val="both"/>
       </w:pPr>
       <w:r>
         <w:rPr>
@@ -29416,7 +29416,7 @@
         <w:keepNext/>
         <w:bidi/>
         <w:spacing w:after="60" w:before="100" w:line="240" w:lineRule="auto"/>
-        <w:jc w:val="right"/>
+        <w:jc w:val="both"/>
       </w:pPr>
       <w:r>
         <w:rPr>
@@ -29487,7 +29487,7 @@
         <w:keepNext/>
         <w:bidi/>
         <w:spacing w:after="60" w:before="100" w:line="240" w:lineRule="auto"/>
-        <w:jc w:val="right"/>
+        <w:jc w:val="both"/>
       </w:pPr>
       <w:r>
         <w:rPr>
@@ -29651,7 +29651,7 @@
         <w:keepNext/>
         <w:bidi/>
         <w:spacing w:after="60" w:before="100" w:line="240" w:lineRule="auto"/>
-        <w:jc w:val="right"/>
+        <w:jc w:val="both"/>
       </w:pPr>
       <w:r>
         <w:rPr>
@@ -29835,7 +29835,7 @@
         <w:keepNext/>
         <w:bidi/>
         <w:spacing w:after="60" w:before="100" w:line="240" w:lineRule="auto"/>
-        <w:jc w:val="right"/>
+        <w:jc w:val="both"/>
       </w:pPr>
       <w:r>
         <w:rPr>
@@ -29877,7 +29877,7 @@
         <w:keepNext/>
         <w:bidi/>
         <w:spacing w:after="60" w:before="100" w:line="240" w:lineRule="auto"/>
-        <w:jc w:val="right"/>
+        <w:jc w:val="both"/>
       </w:pPr>
       <w:r>
         <w:rPr>
@@ -29935,7 +29935,7 @@
         <w:keepNext/>
         <w:bidi/>
         <w:spacing w:after="80" w:before="160" w:line="240" w:lineRule="auto"/>
-        <w:jc w:val="right"/>
+        <w:jc w:val="both"/>
       </w:pPr>
       <w:r>
         <w:rPr>
@@ -30041,7 +30041,7 @@
         <w:keepNext/>
         <w:bidi/>
         <w:spacing w:after="80" w:before="160" w:line="240" w:lineRule="auto"/>
-        <w:jc w:val="right"/>
+        <w:jc w:val="both"/>
       </w:pPr>
       <w:r>
         <w:rPr>
@@ -30209,7 +30209,7 @@
         <w:keepNext/>
         <w:bidi/>
         <w:spacing w:after="80" w:before="160" w:line="240" w:lineRule="auto"/>
-        <w:jc w:val="right"/>
+        <w:jc w:val="both"/>
       </w:pPr>
       <w:r>
         <w:rPr>
@@ -30261,7 +30261,7 @@
         <w:keepNext/>
         <w:bidi/>
         <w:spacing w:after="80" w:before="160" w:line="240" w:lineRule="auto"/>
-        <w:jc w:val="right"/>
+        <w:jc w:val="both"/>
       </w:pPr>
       <w:r>
         <w:rPr>
@@ -30401,7 +30401,7 @@
         <w:keepNext/>
         <w:bidi/>
         <w:spacing w:after="80" w:before="160" w:line="240" w:lineRule="auto"/>
-        <w:jc w:val="right"/>
+        <w:jc w:val="both"/>
       </w:pPr>
       <w:r>
         <w:rPr>
@@ -30622,7 +30622,7 @@
         <w:keepNext/>
         <w:bidi/>
         <w:spacing w:after="80" w:before="160" w:line="240" w:lineRule="auto"/>
-        <w:jc w:val="right"/>
+        <w:jc w:val="both"/>
       </w:pPr>
       <w:r>
         <w:rPr>
@@ -30844,7 +30844,7 @@
         <w:keepNext/>
         <w:bidi/>
         <w:spacing w:after="80" w:before="160" w:line="240" w:lineRule="auto"/>
-        <w:jc w:val="right"/>
+        <w:jc w:val="both"/>
       </w:pPr>
       <w:r>
         <w:rPr>
@@ -30896,7 +30896,7 @@
         <w:keepNext/>
         <w:bidi/>
         <w:spacing w:after="80" w:before="160" w:line="240" w:lineRule="auto"/>
-        <w:jc w:val="right"/>
+        <w:jc w:val="both"/>
       </w:pPr>
       <w:r>
         <w:rPr>
@@ -31096,7 +31096,7 @@
         <w:keepNext/>
         <w:bidi/>
         <w:spacing w:after="80" w:before="160" w:line="240" w:lineRule="auto"/>
-        <w:jc w:val="right"/>
+        <w:jc w:val="both"/>
       </w:pPr>
       <w:r>
         <w:rPr>
@@ -31156,7 +31156,7 @@
         <w:keepNext/>
         <w:bidi/>
         <w:spacing w:after="80" w:before="160" w:line="240" w:lineRule="auto"/>
-        <w:jc w:val="right"/>
+        <w:jc w:val="both"/>
       </w:pPr>
       <w:r>
         <w:rPr>
@@ -31261,7 +31261,7 @@
         <w:keepNext/>
         <w:bidi/>
         <w:spacing w:after="80" w:before="160" w:line="240" w:lineRule="auto"/>
-        <w:jc w:val="right"/>
+        <w:jc w:val="both"/>
       </w:pPr>
       <w:r>
         <w:rPr>
@@ -32047,7 +32047,7 @@
         <w:keepNext/>
         <w:bidi/>
         <w:spacing w:after="80" w:before="160" w:line="240" w:lineRule="auto"/>
-        <w:jc w:val="right"/>
+        <w:jc w:val="both"/>
       </w:pPr>
       <w:r>
         <w:rPr>
@@ -32240,7 +32240,7 @@
         <w:keepNext/>
         <w:bidi/>
         <w:spacing w:after="80" w:before="160" w:line="240" w:lineRule="auto"/>
-        <w:jc w:val="right"/>
+        <w:jc w:val="both"/>
       </w:pPr>
       <w:r>
         <w:rPr>
@@ -32311,7 +32311,7 @@
         <w:keepNext/>
         <w:bidi/>
         <w:spacing w:after="80" w:before="160" w:line="240" w:lineRule="auto"/>
-        <w:jc w:val="right"/>
+        <w:jc w:val="both"/>
       </w:pPr>
       <w:r>
         <w:rPr>
@@ -32365,7 +32365,7 @@
         <w:keepNext/>
         <w:bidi/>
         <w:spacing w:after="80" w:before="160" w:line="240" w:lineRule="auto"/>
-        <w:jc w:val="right"/>
+        <w:jc w:val="both"/>
       </w:pPr>
       <w:r>
         <w:rPr>
@@ -32453,7 +32453,7 @@
         <w:keepNext/>
         <w:bidi/>
         <w:spacing w:after="80" w:before="160" w:line="240" w:lineRule="auto"/>
-        <w:jc w:val="right"/>
+        <w:jc w:val="both"/>
       </w:pPr>
       <w:r>
         <w:rPr>
@@ -32507,7 +32507,7 @@
         <w:keepNext/>
         <w:bidi/>
         <w:spacing w:after="80" w:before="160" w:line="240" w:lineRule="auto"/>
-        <w:jc w:val="right"/>
+        <w:jc w:val="both"/>
       </w:pPr>
       <w:r>
         <w:rPr>
@@ -34417,7 +34417,7 @@
             <w:pPr>
               <w:bidi/>
               <w:spacing w:after="0" w:before="0" w:line="240" w:lineRule="auto"/>
-              <w:jc w:val="right"/>
+              <w:jc w:val="both"/>
             </w:pPr>
             <w:r>
               <w:rPr>
@@ -34497,7 +34497,7 @@
             <w:pPr>
               <w:bidi/>
               <w:spacing w:after="0" w:before="0" w:line="240" w:lineRule="auto"/>
-              <w:jc w:val="right"/>
+              <w:jc w:val="both"/>
             </w:pPr>
             <w:r>
               <w:rPr>
@@ -34577,7 +34577,7 @@
             <w:pPr>
               <w:bidi/>
               <w:spacing w:after="0" w:before="0" w:line="240" w:lineRule="auto"/>
-              <w:jc w:val="right"/>
+              <w:jc w:val="both"/>
             </w:pPr>
             <w:r>
               <w:rPr>
@@ -34657,7 +34657,7 @@
             <w:pPr>
               <w:bidi/>
               <w:spacing w:after="0" w:before="0" w:line="240" w:lineRule="auto"/>
-              <w:jc w:val="right"/>
+              <w:jc w:val="both"/>
             </w:pPr>
             <w:r>
               <w:rPr>
@@ -34737,7 +34737,7 @@
             <w:pPr>
               <w:bidi/>
               <w:spacing w:after="0" w:before="0" w:line="240" w:lineRule="auto"/>
-              <w:jc w:val="right"/>
+              <w:jc w:val="both"/>
             </w:pPr>
             <w:r>
               <w:rPr>
@@ -34817,7 +34817,7 @@
             <w:pPr>
               <w:bidi/>
               <w:spacing w:after="0" w:before="0" w:line="240" w:lineRule="auto"/>
-              <w:jc w:val="right"/>
+              <w:jc w:val="both"/>
             </w:pPr>
             <w:r>
               <w:rPr>
@@ -34897,7 +34897,7 @@
             <w:pPr>
               <w:bidi/>
               <w:spacing w:after="0" w:before="0" w:line="240" w:lineRule="auto"/>
-              <w:jc w:val="right"/>
+              <w:jc w:val="both"/>
             </w:pPr>
             <w:r>
               <w:rPr>
@@ -34977,7 +34977,7 @@
             <w:pPr>
               <w:bidi/>
               <w:spacing w:after="0" w:before="0" w:line="240" w:lineRule="auto"/>
-              <w:jc w:val="right"/>
+              <w:jc w:val="both"/>
             </w:pPr>
             <w:r>
               <w:rPr>
@@ -35057,7 +35057,7 @@
             <w:pPr>
               <w:bidi/>
               <w:spacing w:after="0" w:before="0" w:line="240" w:lineRule="auto"/>
-              <w:jc w:val="right"/>
+              <w:jc w:val="both"/>
             </w:pPr>
             <w:r>
               <w:rPr>
@@ -35137,7 +35137,7 @@
             <w:pPr>
               <w:bidi/>
               <w:spacing w:after="0" w:before="0" w:line="240" w:lineRule="auto"/>
-              <w:jc w:val="right"/>
+              <w:jc w:val="both"/>
             </w:pPr>
             <w:r>
               <w:rPr>
@@ -35217,7 +35217,7 @@
             <w:pPr>
               <w:bidi/>
               <w:spacing w:after="0" w:before="0" w:line="240" w:lineRule="auto"/>
-              <w:jc w:val="right"/>
+              <w:jc w:val="both"/>
             </w:pPr>
             <w:r>
               <w:rPr>
@@ -35297,7 +35297,7 @@
             <w:pPr>
               <w:bidi/>
               <w:spacing w:after="0" w:before="0" w:line="240" w:lineRule="auto"/>
-              <w:jc w:val="right"/>
+              <w:jc w:val="both"/>
             </w:pPr>
             <w:r>
               <w:rPr>
@@ -35377,7 +35377,7 @@
             <w:pPr>
               <w:bidi/>
               <w:spacing w:after="0" w:before="0" w:line="240" w:lineRule="auto"/>
-              <w:jc w:val="right"/>
+              <w:jc w:val="both"/>
             </w:pPr>
             <w:r>
               <w:rPr>
@@ -35457,7 +35457,7 @@
             <w:pPr>
               <w:bidi/>
               <w:spacing w:after="0" w:before="0" w:line="240" w:lineRule="auto"/>
-              <w:jc w:val="right"/>
+              <w:jc w:val="both"/>
             </w:pPr>
             <w:r>
               <w:rPr>
@@ -35537,7 +35537,7 @@
             <w:pPr>
               <w:bidi/>
               <w:spacing w:after="0" w:before="0" w:line="240" w:lineRule="auto"/>
-              <w:jc w:val="right"/>
+              <w:jc w:val="both"/>
             </w:pPr>
             <w:r>
               <w:rPr>
@@ -35617,7 +35617,7 @@
             <w:pPr>
               <w:bidi/>
               <w:spacing w:after="0" w:before="0" w:line="240" w:lineRule="auto"/>
-              <w:jc w:val="right"/>
+              <w:jc w:val="both"/>
             </w:pPr>
             <w:r>
               <w:rPr>
@@ -35697,7 +35697,7 @@
             <w:pPr>
               <w:bidi/>
               <w:spacing w:after="0" w:before="0" w:line="240" w:lineRule="auto"/>
-              <w:jc w:val="right"/>
+              <w:jc w:val="both"/>
             </w:pPr>
             <w:r>
               <w:rPr>
@@ -35777,7 +35777,7 @@
             <w:pPr>
               <w:bidi/>
               <w:spacing w:after="0" w:before="0" w:line="240" w:lineRule="auto"/>
-              <w:jc w:val="right"/>
+              <w:jc w:val="both"/>
             </w:pPr>
             <w:r>
               <w:rPr>
@@ -35857,7 +35857,7 @@
             <w:pPr>
               <w:bidi/>
               <w:spacing w:after="0" w:before="0" w:line="240" w:lineRule="auto"/>
-              <w:jc w:val="right"/>
+              <w:jc w:val="both"/>
             </w:pPr>
             <w:r>
               <w:rPr>
@@ -35937,7 +35937,7 @@
             <w:pPr>
               <w:bidi/>
               <w:spacing w:after="0" w:before="0" w:line="240" w:lineRule="auto"/>
-              <w:jc w:val="right"/>
+              <w:jc w:val="both"/>
             </w:pPr>
             <w:r>
               <w:rPr>
@@ -36017,7 +36017,7 @@
             <w:pPr>
               <w:bidi/>
               <w:spacing w:after="0" w:before="0" w:line="240" w:lineRule="auto"/>
-              <w:jc w:val="right"/>
+              <w:jc w:val="both"/>
             </w:pPr>
             <w:r>
               <w:rPr>
@@ -36097,7 +36097,7 @@
             <w:pPr>
               <w:bidi/>
               <w:spacing w:after="0" w:before="0" w:line="240" w:lineRule="auto"/>
-              <w:jc w:val="right"/>
+              <w:jc w:val="both"/>
             </w:pPr>
             <w:r>
               <w:rPr>
@@ -36177,7 +36177,7 @@
             <w:pPr>
               <w:bidi/>
               <w:spacing w:after="0" w:before="0" w:line="240" w:lineRule="auto"/>
-              <w:jc w:val="right"/>
+              <w:jc w:val="both"/>
             </w:pPr>
             <w:r>
               <w:rPr>
@@ -36257,7 +36257,7 @@
             <w:pPr>
               <w:bidi/>
               <w:spacing w:after="0" w:before="0" w:line="240" w:lineRule="auto"/>
-              <w:jc w:val="right"/>
+              <w:jc w:val="both"/>
             </w:pPr>
             <w:r>
               <w:rPr>
@@ -36320,7 +36320,7 @@
         <w:keepNext/>
         <w:bidi/>
         <w:spacing w:after="80" w:before="160" w:line="240" w:lineRule="auto"/>
-        <w:jc w:val="right"/>
+        <w:jc w:val="both"/>
       </w:pPr>
       <w:r>
         <w:rPr>
@@ -36821,7 +36821,7 @@
         <w:keepNext/>
         <w:bidi/>
         <w:spacing w:after="80" w:before="160" w:line="240" w:lineRule="auto"/>
-        <w:jc w:val="right"/>
+        <w:jc w:val="both"/>
       </w:pPr>
       <w:r>
         <w:rPr>
@@ -37757,7 +37757,7 @@
         <w:keepNext/>
         <w:bidi/>
         <w:spacing w:after="80" w:before="160" w:line="240" w:lineRule="auto"/>
-        <w:jc w:val="right"/>
+        <w:jc w:val="both"/>
       </w:pPr>
       <w:r>
         <w:rPr>
@@ -46067,5 +46067,63 @@
       <w:color w:val="000000"/>
     </w:rPr>
   </w:style>
+  <w:style w:type="paragraph" w:styleId="TOC1">
+    <w:name w:val="toc 1"/>
+    <w:basedOn w:val="Normal"/>
+    <w:next w:val="Normal"/>
+    <w:uiPriority w:val="39"/>
+    <w:pPr>
+      <w:bidi/>
+      <w:spacing w:after="60"/>
+      <w:ind w:start="0"/>
+      <w:jc w:val="both"/>
+    </w:pPr>
+    <w:rPr>
+      <w:rFonts w:ascii="Jameel Noori Nastaleeq" w:cs="Jameel Noori Nastaleeq" w:eastAsia="Jameel Noori Nastaleeq" w:hAnsi="Jameel Noori Nastaleeq"/>
+      <w:b/>
+      <w:bCs/>
+      <w:sz w:val="28"/>
+      <w:szCs w:val="28"/>
+      <w:rtl/>
+    </w:rPr>
+  </w:style>
+  <w:style w:type="paragraph" w:styleId="TOC2">
+    <w:name w:val="toc 2"/>
+    <w:basedOn w:val="Normal"/>
+    <w:next w:val="Normal"/>
+    <w:uiPriority w:val="39"/>
+    <w:pPr>
+      <w:bidi/>
+      <w:spacing w:after="60"/>
+      <w:ind w:start="400"/>
+      <w:jc w:val="both"/>
+    </w:pPr>
+    <w:rPr>
+      <w:rFonts w:ascii="Jameel Noori Nastaleeq" w:cs="Jameel Noori Nastaleeq" w:eastAsia="Jameel Noori Nastaleeq" w:hAnsi="Jameel Noori Nastaleeq"/>
+      <w:b w:val="false"/>
+      <w:sz w:val="28"/>
+      <w:szCs w:val="28"/>
+      <w:rtl/>
+    </w:rPr>
+  </w:style>
+  <w:style w:type="paragraph" w:styleId="TOC3">
+    <w:name w:val="toc 3"/>
+    <w:basedOn w:val="Normal"/>
+    <w:next w:val="Normal"/>
+    <w:uiPriority w:val="39"/>
+    <w:pPr>
+      <w:bidi/>
+      <w:spacing w:after="60"/>
+      <w:ind w:start="800"/>
+      <w:jc w:val="both"/>
+    </w:pPr>
+    <w:rPr>
+      <w:rFonts w:ascii="Jameel Noori Nastaleeq" w:cs="Jameel Noori Nastaleeq" w:eastAsia="Jameel Noori Nastaleeq" w:hAnsi="Jameel Noori Nastaleeq"/>
+      <w:b w:val="false"/>
+      <w:sz w:val="28"/>
+      <w:szCs w:val="28"/>
+      <w:rtl/>
+    </w:rPr>
+  </w:style>
 </w:styles>
 </file>
</xml_diff>